<commit_message>
docs(manuals): describe the follow-up job, the to-close endpoints and the 707 tests in the Spanish technical manual (4.6)
</commit_message>
<xml_diff>
--- a/09_MANUALES/ES/WORD/09_Manual_Tecnico.docx
+++ b/09_MANUALES/ES/WORD/09_Manual_Tecnico.docx
@@ -64,7 +64,7 @@
         <w:pStyle w:val="BodyText"/>
       </w:pPr>
       <w:r>
-        <w:t xml:space="preserve">20 de octubre de 2026</w:t>
+        <w:t xml:space="preserve">21 de octubre de 2026</w:t>
       </w:r>
     </w:p>
     <w:p>
@@ -72,7 +72,7 @@
         <w:pStyle w:val="BodyText"/>
       </w:pPr>
       <w:r>
-        <w:t xml:space="preserve">Tipo de manual: Manual técnico (desarrolladores y arquitectos de software) · Versión 4.4</w:t>
+        <w:t xml:space="preserve">Tipo de manual: Manual técnico (desarrolladores y arquitectos de software) · Versión 4.6</w:t>
       </w:r>
     </w:p>
     <w:bookmarkStart w:id="20" w:name="control-de-versiones"/>
@@ -649,6 +649,182 @@
           </w:p>
         </w:tc>
       </w:tr>
+      <w:tr>
+        <w:tc>
+          <w:tcPr/>
+          <w:p>
+            <w:pPr>
+              <w:pStyle w:val="Compact"/>
+            </w:pPr>
+            <w:r>
+              <w:t xml:space="preserve">4.5</w:t>
+            </w:r>
+          </w:p>
+        </w:tc>
+        <w:tc>
+          <w:tcPr/>
+          <w:p>
+            <w:pPr>
+              <w:pStyle w:val="Compact"/>
+            </w:pPr>
+            <w:r>
+              <w:t xml:space="preserve">2026-10-21</w:t>
+            </w:r>
+          </w:p>
+        </w:tc>
+        <w:tc>
+          <w:tcPr/>
+          <w:p>
+            <w:pPr>
+              <w:pStyle w:val="Compact"/>
+            </w:pPr>
+            <w:r>
+              <w:t xml:space="preserve">Revisión contra el código del 21 de octubre de 2026: el token de una sesión cerrada deja de servir (security-service y gateway, secciones 9.2, 13.2 y 14.1), cierre automático de las reservas vencidas (12.3 y Figura 3), candado de la asignación de operarios y conteo único de reservas sin operario (12.4), comprobante de máximo 2 MB y efectivo solo con su cuenta activa (12.5), cambios de la web y de la app (10.4, 10.5 y 12.7), pruebas del 21 de octubre (689 automatizadas y 19 de punta a punta) y diagnóstico. Se corrigieron además las rutas del gateway que faltaban en la Tabla 5 y la numeración de los changelogs (039 y semillas hasta la 112).</w:t>
+            </w:r>
+          </w:p>
+        </w:tc>
+        <w:tc>
+          <w:tcPr/>
+          <w:p>
+            <w:pPr>
+              <w:pStyle w:val="Compact"/>
+            </w:pPr>
+            <w:r>
+              <w:t xml:space="preserve">Equipo de desarrollo</w:t>
+            </w:r>
+          </w:p>
+        </w:tc>
+      </w:tr>
+      <w:tr>
+        <w:tc>
+          <w:tcPr/>
+          <w:p>
+            <w:pPr>
+              <w:pStyle w:val="Compact"/>
+            </w:pPr>
+            <w:r>
+              <w:t xml:space="preserve">4.6</w:t>
+            </w:r>
+          </w:p>
+        </w:tc>
+        <w:tc>
+          <w:tcPr/>
+          <w:p>
+            <w:pPr>
+              <w:pStyle w:val="Compact"/>
+            </w:pPr>
+            <w:r>
+              <w:t xml:space="preserve">2026-10-21</w:t>
+            </w:r>
+          </w:p>
+        </w:tc>
+        <w:tc>
+          <w:tcPr/>
+          <w:p>
+            <w:pPr>
+              <w:pStyle w:val="Compact"/>
+            </w:pPr>
+            <w:r>
+              <w:t xml:space="preserve">Cambio de la regla de las reservas que terminan sin cerrarse, revisada por el equipo la noche del 21 de octubre:</w:t>
+            </w:r>
+            <w:r>
+              <w:t xml:space="preserve"> </w:t>
+            </w:r>
+            <w:r>
+              <w:rPr>
+                <w:i/>
+                <w:iCs/>
+              </w:rPr>
+              <w:t xml:space="preserve">ExpiredBookingsJob</w:t>
+            </w:r>
+            <w:r>
+              <w:t xml:space="preserve"> </w:t>
+            </w:r>
+            <w:r>
+              <w:t xml:space="preserve">solo cancela las programadas; operations-service (</w:t>
+            </w:r>
+            <w:r>
+              <w:rPr>
+                <w:i/>
+                <w:iCs/>
+              </w:rPr>
+              <w:t xml:space="preserve">FollowUpJob</w:t>
+            </w:r>
+            <w:r>
+              <w:t xml:space="preserve">,</w:t>
+            </w:r>
+            <w:r>
+              <w:t xml:space="preserve"> </w:t>
+            </w:r>
+            <w:r>
+              <w:rPr>
+                <w:i/>
+                <w:iCs/>
+              </w:rPr>
+              <w:t xml:space="preserve">FollowUpPolicy</w:t>
+            </w:r>
+            <w:r>
+              <w:t xml:space="preserve"> </w:t>
+            </w:r>
+            <w:r>
+              <w:t xml:space="preserve">y</w:t>
+            </w:r>
+            <w:r>
+              <w:t xml:space="preserve"> </w:t>
+            </w:r>
+            <w:r>
+              <w:rPr>
+                <w:i/>
+                <w:iCs/>
+              </w:rPr>
+              <w:t xml:space="preserve">FollowUpService</w:t>
+            </w:r>
+            <w:r>
+              <w:t xml:space="preserve">) pasa a NO_SHOW solo la confirmada sin operario, por la ruta interna</w:t>
+            </w:r>
+            <w:r>
+              <w:t xml:space="preserve"> </w:t>
+            </w:r>
+            <w:r>
+              <w:rPr>
+                <w:i/>
+                <w:iCs/>
+              </w:rPr>
+              <w:t xml:space="preserve">/internal/v1/bookings/{id}/no-show</w:t>
+            </w:r>
+            <w:r>
+              <w:t xml:space="preserve">, y deja las demás en la lista "Por cerrar" del administrador (12.3, 12.4, 12.8 y Figura 3); nuevos endpoints, eventos ServiceNotStarted y ServiceNotFinished, tipos de notificación y changelogs 040 y 041 (11.5, 12.6, 13.3 y 13.4); conteo único de reservas sin operario también en la app móvil y demás cambios de la app (12.7); pruebas de la noche del 21 de octubre (707 automatizadas y 19 de punta a punta, 16.5); variables</w:t>
+            </w:r>
+            <w:r>
+              <w:t xml:space="preserve"> </w:t>
+            </w:r>
+            <w:r>
+              <w:rPr>
+                <w:i/>
+                <w:iCs/>
+              </w:rPr>
+              <w:t xml:space="preserve">FOLLOW_UP_*</w:t>
+            </w:r>
+            <w:r>
+              <w:t xml:space="preserve"> </w:t>
+            </w:r>
+            <w:r>
+              <w:t xml:space="preserve">(16.2); diagnóstico y discrepancias (Tablas 26 y 29).</w:t>
+            </w:r>
+          </w:p>
+        </w:tc>
+        <w:tc>
+          <w:tcPr/>
+          <w:p>
+            <w:pPr>
+              <w:pStyle w:val="Compact"/>
+            </w:pPr>
+            <w:r>
+              <w:t xml:space="preserve">Equipo de desarrollo</w:t>
+            </w:r>
+          </w:p>
+        </w:tc>
+      </w:tr>
     </w:tbl>
     <w:p>
       <w:pPr>
@@ -2036,7 +2212,7 @@
         <w:t xml:space="preserve">develop</w:t>
       </w:r>
       <w:r>
-        <w:t xml:space="preserve">, 16 de octubre de 2026): las cifras de tablas, changelogs y pruebas salen de consultas a la base de datos y de la ejecución de las pruebas, no de documentos anteriores. El Anexo B lista las discrepancias encontradas entre el código, la documentación y las versiones anteriores de los manuales, como exige la guía para elaborar manuales (Servicio Nacional de Aprendizaje [SENA], 2026). Los identificadores (esquemas, tablas, columnas, endpoints, eventos y clases) se escriben exactamente como en el código.</w:t>
+        <w:t xml:space="preserve">, 16 de octubre de 2026): las cifras de tablas, changelogs y pruebas salen de consultas a la base de datos y de la ejecución de las pruebas, no de documentos anteriores. La versión 4.5 se revisó contra el código del 21 de octubre de 2026. El Anexo B lista las discrepancias encontradas entre el código, la documentación y las versiones anteriores de los manuales, como exige la guía para elaborar manuales (Servicio Nacional de Aprendizaje [SENA], 2026). Los identificadores (esquemas, tablas, columnas, endpoints, eventos y clases) se escriben exactamente como en el código.</w:t>
       </w:r>
     </w:p>
     <w:bookmarkEnd w:id="22"/>
@@ -2685,7 +2861,7 @@
               <w:t xml:space="preserve"> </w:t>
             </w:r>
             <w:r>
-              <w:t xml:space="preserve">por ruta; CORS.</w:t>
+              <w:t xml:space="preserve">por ruta; CORS; corta los tokens de sesiones cerradas (desde el 21 de octubre de 2026).</w:t>
             </w:r>
           </w:p>
         </w:tc>
@@ -4664,10 +4840,126 @@
           <w:b/>
           <w:bCs/>
         </w:rPr>
-        <w:t xml:space="preserve">No valida tokens</w:t>
-      </w:r>
-      <w:r>
-        <w:t xml:space="preserve">: cada servicio verifica el JWT por sí mismo (ADR-006). No tiene base de datos, caché ni límite de solicitudes. La Tabla 5 muestra las rutas.</w:t>
+        <w:t xml:space="preserve">No verifica la firma de los tokens</w:t>
+      </w:r>
+      <w:r>
+        <w:t xml:space="preserve">: cada servicio verifica el JWT por sí mismo (ADR-006). Desde el 21 de octubre de 2026 sí confirma que la sesión del token siga abierta:</w:t>
+      </w:r>
+      <w:r>
+        <w:t xml:space="preserve"> </w:t>
+      </w:r>
+      <w:r>
+        <w:rPr>
+          <w:i/>
+          <w:iCs/>
+        </w:rPr>
+        <w:t xml:space="preserve">SessionCheckFilter</w:t>
+      </w:r>
+      <w:r>
+        <w:t xml:space="preserve">, que corre justo después del CORS, pregunta a security-service con</w:t>
+      </w:r>
+      <w:r>
+        <w:t xml:space="preserve"> </w:t>
+      </w:r>
+      <w:r>
+        <w:rPr>
+          <w:i/>
+          <w:iCs/>
+        </w:rPr>
+        <w:t xml:space="preserve">GET /api/v1/auth/session</w:t>
+      </w:r>
+      <w:r>
+        <w:t xml:space="preserve"> </w:t>
+      </w:r>
+      <w:r>
+        <w:t xml:space="preserve">y el mismo encabezado</w:t>
+      </w:r>
+      <w:r>
+        <w:t xml:space="preserve"> </w:t>
+      </w:r>
+      <w:r>
+        <w:rPr>
+          <w:i/>
+          <w:iCs/>
+        </w:rPr>
+        <w:t xml:space="preserve">Authorization</w:t>
+      </w:r>
+      <w:r>
+        <w:t xml:space="preserve">; si la respuesta es 401, devuelve ese 401 sin pasar la petición. Guarda cada respuesta 30 segundos por huella SHA-256 del token (nunca el token), olvida la de un token cuando pasa por</w:t>
+      </w:r>
+      <w:r>
+        <w:t xml:space="preserve"> </w:t>
+      </w:r>
+      <w:r>
+        <w:rPr>
+          <w:i/>
+          <w:iCs/>
+        </w:rPr>
+        <w:t xml:space="preserve">POST /api/v1/auth/logout</w:t>
+      </w:r>
+      <w:r>
+        <w:t xml:space="preserve"> </w:t>
+      </w:r>
+      <w:r>
+        <w:t xml:space="preserve">y, si security-service no contesta en 3 segundos o responde 5xx, deja pasar la petición para que una caída de security-service no tumbe el resto de la API. No revisa las rutas públicas, las de</w:t>
+      </w:r>
+      <w:r>
+        <w:t xml:space="preserve"> </w:t>
+      </w:r>
+      <w:r>
+        <w:rPr>
+          <w:i/>
+          <w:iCs/>
+        </w:rPr>
+        <w:t xml:space="preserve">/api/v1/auth/</w:t>
+      </w:r>
+      <w:r>
+        <w:t xml:space="preserve"> </w:t>
+      </w:r>
+      <w:r>
+        <w:t xml:space="preserve">(salvo el logout) ni las solicitudes sin token. Se configura con</w:t>
+      </w:r>
+      <w:r>
+        <w:t xml:space="preserve"> </w:t>
+      </w:r>
+      <w:r>
+        <w:rPr>
+          <w:i/>
+          <w:iCs/>
+        </w:rPr>
+        <w:t xml:space="preserve">SESSION_CHECK_ENABLED</w:t>
+      </w:r>
+      <w:r>
+        <w:t xml:space="preserve">,</w:t>
+      </w:r>
+      <w:r>
+        <w:t xml:space="preserve"> </w:t>
+      </w:r>
+      <w:r>
+        <w:rPr>
+          <w:i/>
+          <w:iCs/>
+        </w:rPr>
+        <w:t xml:space="preserve">SESSION_CHECK_CACHE_TTL</w:t>
+      </w:r>
+      <w:r>
+        <w:t xml:space="preserve"> </w:t>
+      </w:r>
+      <w:r>
+        <w:t xml:space="preserve">y</w:t>
+      </w:r>
+      <w:r>
+        <w:t xml:space="preserve"> </w:t>
+      </w:r>
+      <w:r>
+        <w:rPr>
+          <w:i/>
+          <w:iCs/>
+        </w:rPr>
+        <w:t xml:space="preserve">SESSION_CHECK_TIMEOUT</w:t>
+      </w:r>
+      <w:r>
+        <w:t xml:space="preserve">. No tiene base de datos ni límite de solicitudes. La Tabla 5 muestra las rutas.</w:t>
       </w:r>
     </w:p>
     <w:p>
@@ -4841,7 +5133,7 @@
                 <w:i/>
                 <w:iCs/>
               </w:rPr>
-              <w:t xml:space="preserve">, /api/v1/operator/bookings/*</w:t>
+              <w:t xml:space="preserve">, /api/v1/admin/establishment, /api/v1/operator/bookings/*</w:t>
             </w:r>
           </w:p>
         </w:tc>
@@ -4872,17 +5164,30 @@
                 <w:i/>
                 <w:iCs/>
               </w:rPr>
-              <w:t xml:space="preserve">, /api/v1/admin/assignments/*</w:t>
-            </w:r>
-            <w:r>
-              <w:t xml:space="preserve">, /api/v1/operator/services/*</w:t>
+              <w:t xml:space="preserve">, /api/v1/operators/*</w:t>
+            </w:r>
+            <w:r>
+              <w:t xml:space="preserve">, /api/v1/admin/inspections/*</w:t>
             </w:r>
             <w:r>
               <w:rPr>
                 <w:i/>
                 <w:iCs/>
               </w:rPr>
-              <w:t xml:space="preserve">, /api/v1/operator/ratings, /api/v1/ratings/*</w:t>
+              <w:t xml:space="preserve">, /api/v1/public/inspections/*</w:t>
+            </w:r>
+            <w:r>
+              <w:t xml:space="preserve">, /api/v1/admin/assignments/*</w:t>
+            </w:r>
+            <w:r>
+              <w:rPr>
+                <w:i/>
+                <w:iCs/>
+              </w:rPr>
+              <w:t xml:space="preserve">, /api/v1/operator/services/*</w:t>
+            </w:r>
+            <w:r>
+              <w:t xml:space="preserve">, /api/v1/operator/ratings, /api/v1/ratings/**</w:t>
             </w:r>
           </w:p>
         </w:tc>
@@ -6830,18 +7135,28 @@
               <w:pStyle w:val="Compact"/>
             </w:pPr>
             <w:r>
-              <w:t xml:space="preserve">booking-service /admin/bookings, /operator/bookings, PATCH /operator/bookings/{id}/status, /bookings/me; /internal/v1/bookings y /internal/v1/bookings/{id} (llave interna)</w:t>
-            </w:r>
-          </w:p>
-        </w:tc>
-        <w:tc>
-          <w:tcPr/>
-          <w:p>
-            <w:pPr>
-              <w:pStyle w:val="Compact"/>
-            </w:pPr>
-            <w:r>
-              <w:t xml:space="preserve">Reservas por asignar, con su bahía; pasarlas a IN_PROGRESS o COMPLETED; validar la reserva que se califica; leer la reserva cuando llega BookingConfirmed para la asignación automática, sin token de usuario (ADR-014).</w:t>
+              <w:t xml:space="preserve">booking-service /admin/bookings, /operator/bookings, PATCH /operator/bookings/{id}/status, /bookings/me; /internal/v1/bookings, /internal/v1/bookings/{id} y POST /internal/v1/bookings/{id}/no-show (llave interna)</w:t>
+            </w:r>
+          </w:p>
+        </w:tc>
+        <w:tc>
+          <w:tcPr/>
+          <w:p>
+            <w:pPr>
+              <w:pStyle w:val="Compact"/>
+            </w:pPr>
+            <w:r>
+              <w:t xml:space="preserve">Reservas por asignar, con su bahía; pasarlas a IN_PROGRESS o COMPLETED; validar la reserva que se califica; leer la reserva cuando llega BookingConfirmed para la asignación automática, sin token de usuario (ADR-014); cerrar como NO_SHOW la confirmada que terminó sin operario (</w:t>
+            </w:r>
+            <w:r>
+              <w:rPr>
+                <w:i/>
+                <w:iCs/>
+              </w:rPr>
+              <w:t xml:space="preserve">FollowUpJob</w:t>
+            </w:r>
+            <w:r>
+              <w:t xml:space="preserve">).</w:t>
             </w:r>
           </w:p>
         </w:tc>
@@ -6982,6 +7297,41 @@
             </w:pPr>
             <w:r>
               <w:t xml:space="preserve">Administradores activos que reciben los avisos al personal (ADR-011, sección 10).</w:t>
+            </w:r>
+          </w:p>
+        </w:tc>
+      </w:tr>
+      <w:tr>
+        <w:tc>
+          <w:tcPr/>
+          <w:p>
+            <w:pPr>
+              <w:pStyle w:val="Compact"/>
+            </w:pPr>
+            <w:r>
+              <w:t xml:space="preserve">api-gateway</w:t>
+            </w:r>
+          </w:p>
+        </w:tc>
+        <w:tc>
+          <w:tcPr/>
+          <w:p>
+            <w:pPr>
+              <w:pStyle w:val="Compact"/>
+            </w:pPr>
+            <w:r>
+              <w:t xml:space="preserve">security-service GET /api/v1/auth/session (el mismo token)</w:t>
+            </w:r>
+          </w:p>
+        </w:tc>
+        <w:tc>
+          <w:tcPr/>
+          <w:p>
+            <w:pPr>
+              <w:pStyle w:val="Compact"/>
+            </w:pPr>
+            <w:r>
+              <w:t xml:space="preserve">Confirmar que la sesión del token siga abierta antes de pasar la petición (desde el 21 de octubre de 2026; sección 9.2).</w:t>
             </w:r>
           </w:p>
         </w:tc>
@@ -7354,7 +7704,62 @@
         <w:t xml:space="preserve">sequence_no</w:t>
       </w:r>
       <w:r>
-        <w:t xml:space="preserve">, única por cliente, impide que dos movimientos del libro de puntos se calculen sobre el mismo saldo. Cada caso de uso abre una transacción local que solo escribe los esquemas de su propio servicio; no hay transacciones distribuidas.</w:t>
+        <w:t xml:space="preserve">, única por cliente, impide que dos movimientos del libro de puntos se calculen sobre el mismo saldo. Donde dos operaciones a la vez podrían chocar, los servicios Java toman un candado de aplicación de SQL Server (</w:t>
+      </w:r>
+      <w:r>
+        <w:rPr>
+          <w:i/>
+          <w:iCs/>
+        </w:rPr>
+        <w:t xml:space="preserve">sp_getapplock</w:t>
+      </w:r>
+      <w:r>
+        <w:t xml:space="preserve">, dueño</w:t>
+      </w:r>
+      <w:r>
+        <w:t xml:space="preserve"> </w:t>
+      </w:r>
+      <w:r>
+        <w:rPr>
+          <w:i/>
+          <w:iCs/>
+        </w:rPr>
+        <w:t xml:space="preserve">Transaction</w:t>
+      </w:r>
+      <w:r>
+        <w:t xml:space="preserve">) que se suelta al terminar la transacción: booking-service usa</w:t>
+      </w:r>
+      <w:r>
+        <w:t xml:space="preserve"> </w:t>
+      </w:r>
+      <w:r>
+        <w:rPr>
+          <w:i/>
+          <w:iCs/>
+        </w:rPr>
+        <w:t xml:space="preserve">booking-schedule</w:t>
+      </w:r>
+      <w:r>
+        <w:t xml:space="preserve"> </w:t>
+      </w:r>
+      <w:r>
+        <w:t xml:space="preserve">al crear o reprogramar una reserva y al cerrar las vencidas, y operations-service usa</w:t>
+      </w:r>
+      <w:r>
+        <w:t xml:space="preserve"> </w:t>
+      </w:r>
+      <w:r>
+        <w:rPr>
+          <w:i/>
+          <w:iCs/>
+        </w:rPr>
+        <w:t xml:space="preserve">operations-assignment</w:t>
+      </w:r>
+      <w:r>
+        <w:t xml:space="preserve"> </w:t>
+      </w:r>
+      <w:r>
+        <w:t xml:space="preserve">en la asignación manual y la automática (desde el 21 de octubre de 2026), con una espera máxima de 10 segundos. Cada caso de uso abre una transacción local que solo escribe los esquemas de su propio servicio; no hay transacciones distribuidas.</w:t>
       </w:r>
     </w:p>
     <w:bookmarkEnd w:id="45"/>
@@ -7611,7 +8016,7 @@
               <w:pStyle w:val="Compact"/>
             </w:pPr>
             <w:r>
-              <w:t xml:space="preserve">VALIDATION_ERROR, INVALID_PLATE, UNKNOWN_PERMISSION, NOTIFICATION_TYPE_NOT_ALLOWED</w:t>
+              <w:t xml:space="preserve">VALIDATION_ERROR, INVALID_PLATE, UNKNOWN_PERMISSION, NOTIFICATION_TYPE_NOT_ALLOWED, RECEIPT_TOO_LARGE</w:t>
             </w:r>
           </w:p>
         </w:tc>
@@ -7635,7 +8040,7 @@
               <w:pStyle w:val="Compact"/>
             </w:pPr>
             <w:r>
-              <w:t xml:space="preserve">Autenticación ausente, no válida o vencida.</w:t>
+              <w:t xml:space="preserve">Autenticación ausente, no válida o vencida, o sesión cerrada.</w:t>
             </w:r>
           </w:p>
         </w:tc>
@@ -8734,7 +9139,7 @@
         <w:rPr>
           <w:rStyle w:val="VerbatimChar"/>
         </w:rPr>
-        <w:t xml:space="preserve">|   |   |-- models/, utils/ (api-error.ts traduce los códigos de error)</w:t>
+        <w:t xml:space="preserve">|   |   |-- models/, utils/ (api-error.ts traduce los códigos de error; image-compress.ts deja el comprobante en máximo 2 MB)</w:t>
       </w:r>
       <w:r>
         <w:br/>
@@ -8743,7 +9148,7 @@
         <w:rPr>
           <w:rStyle w:val="VerbatimChar"/>
         </w:rPr>
-        <w:t xml:space="preserve">|   |   `-- services/   auth, booking-api, operations-api, payments-api, promotions-api,</w:t>
+        <w:t xml:space="preserve">|   |   `-- services/   auth (sesión sincronizada entre pestañas), booking-api, operations-api,</w:t>
       </w:r>
       <w:r>
         <w:br/>
@@ -8752,7 +9157,7 @@
         <w:rPr>
           <w:rStyle w:val="VerbatimChar"/>
         </w:rPr>
-        <w:t xml:space="preserve">|   |                   loyalty-api, role-permissions-api, notifications, vehicles,</w:t>
+        <w:t xml:space="preserve">|   |                   payments-api, promotions-api, loyalty-api, role-permissions-api,</w:t>
       </w:r>
       <w:r>
         <w:br/>
@@ -8761,7 +9166,16 @@
         <w:rPr>
           <w:rStyle w:val="VerbatimChar"/>
         </w:rPr>
-        <w:t xml:space="preserve">|   |                   user-admin, preferences, inspection-store, photo-storage...</w:t>
+        <w:t xml:space="preserve">|   |                   notifications, vehicles, user-admin, preferences, inspection-api,</w:t>
+      </w:r>
+      <w:r>
+        <w:br/>
+      </w:r>
+      <w:r>
+        <w:rPr>
+          <w:rStyle w:val="VerbatimChar"/>
+        </w:rPr>
+        <w:t xml:space="preserve">|   |                   inspection-photos...</w:t>
       </w:r>
       <w:r>
         <w:br/>
@@ -9208,6 +9622,104 @@
       </w:r>
       <w:r>
         <w:t xml:space="preserve">, en los cuatro idiomas.</w:t>
+      </w:r>
+    </w:p>
+    <w:p>
+      <w:pPr>
+        <w:pStyle w:val="BodyText"/>
+      </w:pPr>
+      <w:r>
+        <w:t xml:space="preserve">Desde el 21 de octubre de 2026,</w:t>
+      </w:r>
+      <w:r>
+        <w:t xml:space="preserve"> </w:t>
+      </w:r>
+      <w:r>
+        <w:rPr>
+          <w:i/>
+          <w:iCs/>
+        </w:rPr>
+        <w:t xml:space="preserve">core/services/payments/receiptImage.ts</w:t>
+      </w:r>
+      <w:r>
+        <w:t xml:space="preserve"> </w:t>
+      </w:r>
+      <w:r>
+        <w:t xml:space="preserve">comprime el comprobante de pago a máximo 2 MB antes de subirlo,</w:t>
+      </w:r>
+      <w:r>
+        <w:t xml:space="preserve"> </w:t>
+      </w:r>
+      <w:r>
+        <w:rPr>
+          <w:i/>
+          <w:iCs/>
+        </w:rPr>
+        <w:t xml:space="preserve">shared/components/feedback/ImageZoomModal.tsx</w:t>
+      </w:r>
+      <w:r>
+        <w:t xml:space="preserve"> </w:t>
+      </w:r>
+      <w:r>
+        <w:t xml:space="preserve">amplía el QR de la cuenta de pago y</w:t>
+      </w:r>
+      <w:r>
+        <w:t xml:space="preserve"> </w:t>
+      </w:r>
+      <w:r>
+        <w:rPr>
+          <w:i/>
+          <w:iCs/>
+        </w:rPr>
+        <w:t xml:space="preserve">app/providers/AppUpdatesCheck.tsx</w:t>
+      </w:r>
+      <w:r>
+        <w:t xml:space="preserve"> </w:t>
+      </w:r>
+      <w:r>
+        <w:t xml:space="preserve">lee</w:t>
+      </w:r>
+      <w:r>
+        <w:t xml:space="preserve"> </w:t>
+      </w:r>
+      <w:r>
+        <w:rPr>
+          <w:i/>
+          <w:iCs/>
+        </w:rPr>
+        <w:t xml:space="preserve">/app/version.json</w:t>
+      </w:r>
+      <w:r>
+        <w:t xml:space="preserve"> </w:t>
+      </w:r>
+      <w:r>
+        <w:t xml:space="preserve">al abrir el APK instalado: si hay un</w:t>
+      </w:r>
+      <w:r>
+        <w:t xml:space="preserve"> </w:t>
+      </w:r>
+      <w:r>
+        <w:rPr>
+          <w:i/>
+          <w:iCs/>
+        </w:rPr>
+        <w:t xml:space="preserve">versionCode</w:t>
+      </w:r>
+      <w:r>
+        <w:t xml:space="preserve"> </w:t>
+      </w:r>
+      <w:r>
+        <w:t xml:space="preserve">mayor, muestra encima de todo una pantalla que no se cierra y solo deja descargar el APK nuevo; si el servidor no responde, la aplicación sigue (</w:t>
+      </w:r>
+      <w:r>
+        <w:rPr>
+          <w:i/>
+          <w:iCs/>
+        </w:rPr>
+        <w:t xml:space="preserve">core/services/appUpdates/publishedApk.ts</w:t>
+      </w:r>
+      <w:r>
+        <w:t xml:space="preserve">).</w:t>
       </w:r>
     </w:p>
     <w:bookmarkEnd w:id="55"/>
@@ -15440,6 +15952,60 @@
               <w:pStyle w:val="Compact"/>
             </w:pPr>
             <w:r>
+              <w:t xml:space="preserve">follow_up_notice_at</w:t>
+            </w:r>
+          </w:p>
+        </w:tc>
+        <w:tc>
+          <w:tcPr/>
+          <w:p>
+            <w:pPr>
+              <w:pStyle w:val="Compact"/>
+            </w:pPr>
+            <w:r>
+              <w:t xml:space="preserve">DATETIME2(3)</w:t>
+            </w:r>
+          </w:p>
+        </w:tc>
+        <w:tc>
+          <w:tcPr/>
+          <w:p>
+            <w:pPr>
+              <w:pStyle w:val="Compact"/>
+            </w:pPr>
+            <w:r>
+              <w:t xml:space="preserve">Sí</w:t>
+            </w:r>
+          </w:p>
+        </w:tc>
+        <w:tc>
+          <w:tcPr/>
+          <w:p>
+            <w:pPr>
+              <w:pStyle w:val="Compact"/>
+            </w:pPr>
+            <w:r>
+              <w:t xml:space="preserve">Cuándo se avisó que el servicio terminó sin registrarse; se borra al iniciarlo (changelog 040)</w:t>
+            </w:r>
+          </w:p>
+        </w:tc>
+      </w:tr>
+      <w:tr>
+        <w:tc>
+          <w:tcPr/>
+          <w:p>
+            <w:pPr>
+              <w:pStyle w:val="Compact"/>
+            </w:pPr>
+          </w:p>
+        </w:tc>
+        <w:tc>
+          <w:tcPr/>
+          <w:p>
+            <w:pPr>
+              <w:pStyle w:val="Compact"/>
+            </w:pPr>
+            <w:r>
               <w:t xml:space="preserve">quality_rating, quality_comment, rated_at</w:t>
             </w:r>
           </w:p>
@@ -15890,7 +16456,7 @@
         <w:t xml:space="preserve"> </w:t>
       </w:r>
       <w:r>
-        <w:t xml:space="preserve">Fuente: changelogs 007, 033 y 037 y semilla 105 de operations-service.</w:t>
+        <w:t xml:space="preserve">Fuente: changelogs 007, 033, 037 y 040 y semilla 105 de operations-service.</w:t>
       </w:r>
     </w:p>
     <w:p>
@@ -17376,7 +17942,7 @@
               <w:pStyle w:val="Compact"/>
             </w:pPr>
             <w:r>
-              <w:t xml:space="preserve">24 tipos (de cliente, de personal, de pago, de fidelización, de inspección, de reserva sin operario, de versión nueva de la app y de sistema)</w:t>
+              <w:t xml:space="preserve">26 tipos (de cliente, de personal, de pago, de fidelización, de inspección, de reserva sin operario, de versión nueva de la app, de servicio sin registrar, changelog 041, y de sistema)</w:t>
             </w:r>
           </w:p>
         </w:tc>
@@ -17908,6 +18474,56 @@
               <w:pStyle w:val="Compact"/>
             </w:pPr>
             <w:r>
+              <w:t xml:space="preserve">Una asignación manual y una automática simultáneas no le dan al mismo operario dos servicios a la misma hora.</w:t>
+            </w:r>
+          </w:p>
+        </w:tc>
+        <w:tc>
+          <w:tcPr/>
+          <w:p>
+            <w:pPr>
+              <w:pStyle w:val="Compact"/>
+            </w:pPr>
+            <w:r>
+              <w:t xml:space="preserve">Candado</w:t>
+            </w:r>
+            <w:r>
+              <w:t xml:space="preserve"> </w:t>
+            </w:r>
+            <w:r>
+              <w:rPr>
+                <w:i/>
+                <w:iCs/>
+              </w:rPr>
+              <w:t xml:space="preserve">operations-assignment</w:t>
+            </w:r>
+            <w:r>
+              <w:t xml:space="preserve"> </w:t>
+            </w:r>
+            <w:r>
+              <w:t xml:space="preserve">(</w:t>
+            </w:r>
+            <w:r>
+              <w:rPr>
+                <w:i/>
+                <w:iCs/>
+              </w:rPr>
+              <w:t xml:space="preserve">sp_getapplock</w:t>
+            </w:r>
+            <w:r>
+              <w:t xml:space="preserve">) en operations-service.</w:t>
+            </w:r>
+          </w:p>
+        </w:tc>
+      </w:tr>
+      <w:tr>
+        <w:tc>
+          <w:tcPr/>
+          <w:p>
+            <w:pPr>
+              <w:pStyle w:val="Compact"/>
+            </w:pPr>
+            <w:r>
               <w:t xml:space="preserve">Solo el operario asignado inicia o finaliza; solo el día de la reserva; un servicio a la vez.</w:t>
             </w:r>
           </w:p>
@@ -17992,6 +18608,40 @@
             </w:pPr>
             <w:r>
               <w:t xml:space="preserve">payment-service (409 TRANSACTION_REFERENCE_REUSED).</w:t>
+            </w:r>
+          </w:p>
+        </w:tc>
+      </w:tr>
+      <w:tr>
+        <w:tc>
+          <w:tcPr/>
+          <w:p>
+            <w:pPr>
+              <w:pStyle w:val="Compact"/>
+            </w:pPr>
+            <w:r>
+              <w:t xml:space="preserve">El comprobante del cliente pesa como máximo 2 MB.</w:t>
+            </w:r>
+          </w:p>
+        </w:tc>
+        <w:tc>
+          <w:tcPr/>
+          <w:p>
+            <w:pPr>
+              <w:pStyle w:val="Compact"/>
+            </w:pPr>
+            <w:r>
+              <w:t xml:space="preserve">Dominio de payment-service (</w:t>
+            </w:r>
+            <w:r>
+              <w:rPr>
+                <w:i/>
+                <w:iCs/>
+              </w:rPr>
+              <w:t xml:space="preserve">Payment.MaxReceiptBytes</w:t>
+            </w:r>
+            <w:r>
+              <w:t xml:space="preserve">, 400 RECEIPT_TOO_LARGE).</w:t>
             </w:r>
           </w:p>
         </w:tc>
@@ -18182,7 +18832,20 @@
         <w:t xml:space="preserve"> </w:t>
       </w:r>
       <w:r>
-        <w:t xml:space="preserve">converge con una creada por los servicios. La numeración es compartida (001 a 013 esquemas iniciales, 014 en adelante cambios posteriores, 101 a 109 semillas), salvo en payment-service, que usa su propia numeración 001 a 020 (TD-019). El número más alto de la numeración global es 030; el siguiente changeset compartido es el 031. La lista de changelogs de cada servicio está en el Manual de Instalación, sección 11.2.</w:t>
+        <w:t xml:space="preserve">converge con una creada por los servicios. La numeración es compartida (001 a 013 esquemas iniciales, 014 en adelante cambios posteriores, 101 a 112 semillas), salvo en payment-service, que usa su propia numeración 001 a 020 (TD-019). El número más alto de la numeración global es 041 (040 de operations-service y 041 de notification-service, del 21 de octubre de 2026); el siguiente changeset compartido es el 042. La semilla más reciente es la 112 de booking-service (motivo de cancelación</w:t>
+      </w:r>
+      <w:r>
+        <w:t xml:space="preserve"> </w:t>
+      </w:r>
+      <w:r>
+        <w:rPr>
+          <w:i/>
+          <w:iCs/>
+        </w:rPr>
+        <w:t xml:space="preserve">EXPIRED</w:t>
+      </w:r>
+      <w:r>
+        <w:t xml:space="preserve">, 21 de octubre de 2026). La lista de changelogs de cada servicio está en el Manual de Instalación, sección 11.2.</w:t>
       </w:r>
     </w:p>
     <w:bookmarkEnd w:id="67"/>
@@ -18238,7 +18901,20 @@
         <w:t xml:space="preserve"> </w:t>
       </w:r>
       <w:r>
-        <w:t xml:space="preserve">AuthController, UserProfileController, UserAdministrationController, InternalUserController y el controlador de roles y permisos; AuthenticationService, AccountRegistrationService, PasswordRecoveryService, EmailChangeService, AccountDeactivationService, UserAdministrationService, UserPreferenceService; PasswordPolicy; JwtTokenIssuer; LoginLockout y LoginLockoutPersistenceAdapter; UserAddressController; EmailResetCodeNotifier; RabbitDomainEventPublisher; DevDataSeeder.</w:t>
+        <w:t xml:space="preserve">AuthController (incluye</w:t>
+      </w:r>
+      <w:r>
+        <w:t xml:space="preserve"> </w:t>
+      </w:r>
+      <w:r>
+        <w:rPr>
+          <w:i/>
+          <w:iCs/>
+        </w:rPr>
+        <w:t xml:space="preserve">GET /api/v1/auth/session</w:t>
+      </w:r>
+      <w:r>
+        <w:t xml:space="preserve">), ActiveSessionValidator, UserProfileController, UserAdministrationController, InternalUserController y el controlador de roles y permisos; AuthenticationService, AccountRegistrationService, PasswordRecoveryService, EmailChangeService, AccountDeactivationService, UserAdministrationService, UserPreferenceService; PasswordPolicy; JwtTokenIssuer; LoginLockout y LoginLockoutPersistenceAdapter; UserAddressController; EmailResetCodeNotifier; RabbitDomainEventPublisher; DevDataSeeder.</w:t>
       </w:r>
     </w:p>
     <w:p>
@@ -18313,7 +18989,55 @@
         <w:t xml:space="preserve">acceptsDataPolicy</w:t>
       </w:r>
       <w:r>
-        <w:t xml:space="preserve">.</w:t>
+        <w:t xml:space="preserve">; cada token lleva en el claim</w:t>
+      </w:r>
+      <w:r>
+        <w:t xml:space="preserve"> </w:t>
+      </w:r>
+      <w:r>
+        <w:rPr>
+          <w:i/>
+          <w:iCs/>
+        </w:rPr>
+        <w:t xml:space="preserve">sid</w:t>
+      </w:r>
+      <w:r>
+        <w:t xml:space="preserve"> </w:t>
+      </w:r>
+      <w:r>
+        <w:t xml:space="preserve">su sesión, y desde el 21 de octubre de 2026</w:t>
+      </w:r>
+      <w:r>
+        <w:t xml:space="preserve"> </w:t>
+      </w:r>
+      <w:r>
+        <w:rPr>
+          <w:i/>
+          <w:iCs/>
+        </w:rPr>
+        <w:t xml:space="preserve">ActiveSessionValidator</w:t>
+      </w:r>
+      <w:r>
+        <w:t xml:space="preserve"> </w:t>
+      </w:r>
+      <w:r>
+        <w:t xml:space="preserve">rechaza el token de una sesión cerrada (logout, cuenta inhabilitada por el administrador o desactivada por el dueño) en todas las rutas de security-service;</w:t>
+      </w:r>
+      <w:r>
+        <w:t xml:space="preserve"> </w:t>
+      </w:r>
+      <w:r>
+        <w:rPr>
+          <w:i/>
+          <w:iCs/>
+        </w:rPr>
+        <w:t xml:space="preserve">GET /api/v1/auth/session</w:t>
+      </w:r>
+      <w:r>
+        <w:t xml:space="preserve"> </w:t>
+      </w:r>
+      <w:r>
+        <w:t xml:space="preserve">responde 204 si la sesión sigue abierta y 401 si no, para el gateway.</w:t>
       </w:r>
     </w:p>
     <w:p>
@@ -18698,7 +19422,33 @@
         <w:t xml:space="preserve"> </w:t>
       </w:r>
       <w:r>
-        <w:t xml:space="preserve">sirven a operations-service con la llave interna.</w:t>
+        <w:t xml:space="preserve">sirven a operations-service con la llave interna; crear, reprogramar, cerrar reservas vencidas y marcar una reserva sin operario como NO_SHOW toman el candado de la agenda (</w:t>
+      </w:r>
+      <w:r>
+        <w:rPr>
+          <w:i/>
+          <w:iCs/>
+        </w:rPr>
+        <w:t xml:space="preserve">sp_getapplock</w:t>
+      </w:r>
+      <w:r>
+        <w:t xml:space="preserve"> </w:t>
+      </w:r>
+      <w:r>
+        <w:t xml:space="preserve">sobre</w:t>
+      </w:r>
+      <w:r>
+        <w:t xml:space="preserve"> </w:t>
+      </w:r>
+      <w:r>
+        <w:rPr>
+          <w:i/>
+          <w:iCs/>
+        </w:rPr>
+        <w:t xml:space="preserve">booking-schedule</w:t>
+      </w:r>
+      <w:r>
+        <w:t xml:space="preserve">).</w:t>
       </w:r>
       <w:r>
         <w:t xml:space="preserve"> </w:t>
@@ -18708,13 +19458,139 @@
           <w:b/>
           <w:bCs/>
         </w:rPr>
+        <w:t xml:space="preserve">Reservas vencidas (desde el 21 de octubre de 2026):</w:t>
+      </w:r>
+      <w:r>
+        <w:t xml:space="preserve"> </w:t>
+      </w:r>
+      <w:r>
+        <w:t xml:space="preserve">cada 5 minutos</w:t>
+      </w:r>
+      <w:r>
+        <w:t xml:space="preserve"> </w:t>
+      </w:r>
+      <w:r>
+        <w:rPr>
+          <w:i/>
+          <w:iCs/>
+        </w:rPr>
+        <w:t xml:space="preserve">ExpiredBookingsJob</w:t>
+      </w:r>
+      <w:r>
+        <w:t xml:space="preserve"> </w:t>
+      </w:r>
+      <w:r>
+        <w:t xml:space="preserve">llama a</w:t>
+      </w:r>
+      <w:r>
+        <w:t xml:space="preserve"> </w:t>
+      </w:r>
+      <w:r>
+        <w:rPr>
+          <w:i/>
+          <w:iCs/>
+        </w:rPr>
+        <w:t xml:space="preserve">BookingService.closeExpired</w:t>
+      </w:r>
+      <w:r>
+        <w:t xml:space="preserve">, que cancela solo las reservas que siguen SCHEDULED una hora después de su hora de fin (</w:t>
+      </w:r>
+      <w:r>
+        <w:rPr>
+          <w:i/>
+          <w:iCs/>
+        </w:rPr>
+        <w:t xml:space="preserve">BOOKING_EXPIRY_GRACE_MINUTES</w:t>
+      </w:r>
+      <w:r>
+        <w:t xml:space="preserve">), con el motivo del sistema</w:t>
+      </w:r>
+      <w:r>
+        <w:t xml:space="preserve"> </w:t>
+      </w:r>
+      <w:r>
+        <w:rPr>
+          <w:i/>
+          <w:iCs/>
+        </w:rPr>
+        <w:t xml:space="preserve">EXPIRED</w:t>
+      </w:r>
+      <w:r>
+        <w:t xml:space="preserve"> </w:t>
+      </w:r>
+      <w:r>
+        <w:t xml:space="preserve">(semilla 112), que no aparece en la lista de motivos. Una CONFIRMED nunca se cierra desde booking-service, porque pudo atenderse sin registrarse: la decide operations-service (sección 12.4). Para la que nunca tuvo operario, operations-service llama a la ruta interna</w:t>
+      </w:r>
+      <w:r>
+        <w:t xml:space="preserve"> </w:t>
+      </w:r>
+      <w:r>
+        <w:rPr>
+          <w:i/>
+          <w:iCs/>
+        </w:rPr>
+        <w:t xml:space="preserve">POST /internal/v1/bookings/{id}/no-show</w:t>
+      </w:r>
+      <w:r>
+        <w:t xml:space="preserve"> </w:t>
+      </w:r>
+      <w:r>
+        <w:t xml:space="preserve">(</w:t>
+      </w:r>
+      <w:r>
+        <w:rPr>
+          <w:i/>
+          <w:iCs/>
+        </w:rPr>
+        <w:t xml:space="preserve">BookingService.markUnattended</w:t>
+      </w:r>
+      <w:r>
+        <w:t xml:space="preserve">), que vuelve a comprobar que la reserva está CONFIRMED y ya venció (409 BOOKING_NOT_EXPIRED si no) y la pasa a NO_SHOW. Nada se reembolsa solo. La tarea se apaga con</w:t>
+      </w:r>
+      <w:r>
+        <w:t xml:space="preserve"> </w:t>
+      </w:r>
+      <w:r>
+        <w:rPr>
+          <w:i/>
+          <w:iCs/>
+        </w:rPr>
+        <w:t xml:space="preserve">BOOKING_EXPIRY_CHECK_ENABLED=false</w:t>
+      </w:r>
+      <w:r>
+        <w:t xml:space="preserve"> </w:t>
+      </w:r>
+      <w:r>
+        <w:t xml:space="preserve">y su intervalo es</w:t>
+      </w:r>
+      <w:r>
+        <w:t xml:space="preserve"> </w:t>
+      </w:r>
+      <w:r>
+        <w:rPr>
+          <w:i/>
+          <w:iCs/>
+        </w:rPr>
+        <w:t xml:space="preserve">BOOKING_EXPIRY_CHECK_INTERVAL</w:t>
+      </w:r>
+      <w:r>
+        <w:t xml:space="preserve">.</w:t>
+      </w:r>
+      <w:r>
+        <w:t xml:space="preserve"> </w:t>
+      </w:r>
+      <w:r>
+        <w:rPr>
+          <w:b/>
+          <w:bCs/>
+        </w:rPr>
         <w:t xml:space="preserve">Eventos:</w:t>
       </w:r>
       <w:r>
         <w:t xml:space="preserve"> </w:t>
       </w:r>
       <w:r>
-        <w:t xml:space="preserve">publica BookingConfirmed (creada o reprogramada) y BookingCancelled.</w:t>
+        <w:t xml:space="preserve">publica BookingConfirmed (creada o reprogramada) y BookingCancelled (también al cancelar una reserva vencida; el paso a NO_SHOW no publica evento).</w:t>
       </w:r>
     </w:p>
     <w:bookmarkEnd w:id="71"/>
@@ -18866,7 +19742,75 @@
         <w:t xml:space="preserve"> </w:t>
       </w:r>
       <w:r>
-        <w:t xml:space="preserve">incluyen la bahía de la reserva (ADR-015).</w:t>
+        <w:t xml:space="preserve">incluyen la bahía de la reserva (ADR-015). Desde el 21 de octubre de 2026 la asignación manual y la automática toman el mismo candado (</w:t>
+      </w:r>
+      <w:r>
+        <w:rPr>
+          <w:i/>
+          <w:iCs/>
+        </w:rPr>
+        <w:t xml:space="preserve">ExecutionRepository.lockAssignments</w:t>
+      </w:r>
+      <w:r>
+        <w:t xml:space="preserve">,</w:t>
+      </w:r>
+      <w:r>
+        <w:t xml:space="preserve"> </w:t>
+      </w:r>
+      <w:r>
+        <w:rPr>
+          <w:i/>
+          <w:iCs/>
+        </w:rPr>
+        <w:t xml:space="preserve">sp_getapplock</w:t>
+      </w:r>
+      <w:r>
+        <w:t xml:space="preserve"> </w:t>
+      </w:r>
+      <w:r>
+        <w:t xml:space="preserve">sobre</w:t>
+      </w:r>
+      <w:r>
+        <w:t xml:space="preserve"> </w:t>
+      </w:r>
+      <w:r>
+        <w:rPr>
+          <w:i/>
+          <w:iCs/>
+        </w:rPr>
+        <w:t xml:space="preserve">operations-assignment</w:t>
+      </w:r>
+      <w:r>
+        <w:t xml:space="preserve">) antes de leer las reservas del operario y guardar, y</w:t>
+      </w:r>
+      <w:r>
+        <w:t xml:space="preserve"> </w:t>
+      </w:r>
+      <w:r>
+        <w:rPr>
+          <w:i/>
+          <w:iCs/>
+        </w:rPr>
+        <w:t xml:space="preserve">GET /api/v1/admin/assignments/unassigned</w:t>
+      </w:r>
+      <w:r>
+        <w:t xml:space="preserve"> </w:t>
+      </w:r>
+      <w:r>
+        <w:t xml:space="preserve">devuelve</w:t>
+      </w:r>
+      <w:r>
+        <w:t xml:space="preserve"> </w:t>
+      </w:r>
+      <w:r>
+        <w:rPr>
+          <w:i/>
+          <w:iCs/>
+        </w:rPr>
+        <w:t xml:space="preserve">{count, bookingIds}</w:t>
+      </w:r>
+      <w:r>
+        <w:t xml:space="preserve">, el único conteo de reservas sin operario (SCHEDULED o CONFIRMED, sin operario en ninguna línea y cuya hora no ha terminado) que usan el panel y la pantalla de reservas de la web y de la app móvil.</w:t>
       </w:r>
       <w:r>
         <w:t xml:space="preserve"> </w:t>
@@ -18876,26 +19820,178 @@
           <w:b/>
           <w:bCs/>
         </w:rPr>
-        <w:t xml:space="preserve">Inspección (RF-036):</w:t>
-      </w:r>
-      <w:r>
-        <w:t xml:space="preserve"> </w:t>
-      </w:r>
-      <w:r>
-        <w:t xml:space="preserve">solo para servicios de 180 minutos o más; fases Recepción, Exterior, Interior, Motor y Entrega; hasta cinco fotos de 2 MB por hallazgo, guardadas en</w:t>
-      </w:r>
-      <w:r>
-        <w:t xml:space="preserve"> </w:t>
-      </w:r>
-      <w:r>
-        <w:rPr>
-          <w:i/>
-          <w:iCs/>
-        </w:rPr>
-        <w:t xml:space="preserve">execution.inspection_photo</w:t>
-      </w:r>
-      <w:r>
-        <w:t xml:space="preserve">; el enlace público usa un token aleatorio y solo funciona después de publicar.</w:t>
+        <w:t xml:space="preserve">Reservas que terminaron sin cerrarse (desde el 21 de octubre de 2026):</w:t>
+      </w:r>
+      <w:r>
+        <w:t xml:space="preserve"> </w:t>
+      </w:r>
+      <w:r>
+        <w:t xml:space="preserve">cada 5 minutos</w:t>
+      </w:r>
+      <w:r>
+        <w:t xml:space="preserve"> </w:t>
+      </w:r>
+      <w:r>
+        <w:rPr>
+          <w:i/>
+          <w:iCs/>
+        </w:rPr>
+        <w:t xml:space="preserve">FollowUpJob</w:t>
+      </w:r>
+      <w:r>
+        <w:t xml:space="preserve"> </w:t>
+      </w:r>
+      <w:r>
+        <w:t xml:space="preserve">llama a</w:t>
+      </w:r>
+      <w:r>
+        <w:t xml:space="preserve"> </w:t>
+      </w:r>
+      <w:r>
+        <w:rPr>
+          <w:i/>
+          <w:iCs/>
+        </w:rPr>
+        <w:t xml:space="preserve">FollowUpService.followUp</w:t>
+      </w:r>
+      <w:r>
+        <w:t xml:space="preserve">, que revisa las reservas de los últimos 7 días con</w:t>
+      </w:r>
+      <w:r>
+        <w:t xml:space="preserve"> </w:t>
+      </w:r>
+      <w:r>
+        <w:rPr>
+          <w:i/>
+          <w:iCs/>
+        </w:rPr>
+        <w:t xml:space="preserve">FollowUpPolicy</w:t>
+      </w:r>
+      <w:r>
+        <w:t xml:space="preserve">. La política solo decide sola cuando está segura: NO_OPERATOR (CONFIRMED sin operario, una hora después de su fin) se cierra como NO_SHOW mediante la ruta interna de booking-service; NOT_STARTED (CONFIRMED con operario, sin iniciar cuando terminó su hora) y NOT_FINISHED (IN_PROGRESS sin finalizar una hora después de su fin) nunca se marcan solas y quedan "por cerrar". Para estas dos, operations-service publica una sola vez ServiceNotStarted o ServiceNotFinished y guarda la hora del aviso en</w:t>
+      </w:r>
+      <w:r>
+        <w:t xml:space="preserve"> </w:t>
+      </w:r>
+      <w:r>
+        <w:rPr>
+          <w:i/>
+          <w:iCs/>
+        </w:rPr>
+        <w:t xml:space="preserve">execution.service_execution.follow_up_notice_at</w:t>
+      </w:r>
+      <w:r>
+        <w:t xml:space="preserve"> </w:t>
+      </w:r>
+      <w:r>
+        <w:t xml:space="preserve">(changelog 040), que se borra al iniciar el servicio.</w:t>
+      </w:r>
+      <w:r>
+        <w:t xml:space="preserve"> </w:t>
+      </w:r>
+      <w:r>
+        <w:rPr>
+          <w:i/>
+          <w:iCs/>
+        </w:rPr>
+        <w:t xml:space="preserve">GET /api/v1/admin/assignments/to-close</w:t>
+      </w:r>
+      <w:r>
+        <w:t xml:space="preserve"> </w:t>
+      </w:r>
+      <w:r>
+        <w:t xml:space="preserve">lista las reservas por cerrar (por defecto, la última semana) y</w:t>
+      </w:r>
+      <w:r>
+        <w:t xml:space="preserve"> </w:t>
+      </w:r>
+      <w:r>
+        <w:rPr>
+          <w:i/>
+          <w:iCs/>
+        </w:rPr>
+        <w:t xml:space="preserve">POST /api/v1/admin/assignments/{bookingId}/attended</w:t>
+      </w:r>
+      <w:r>
+        <w:t xml:space="preserve"> </w:t>
+      </w:r>
+      <w:r>
+        <w:t xml:space="preserve">(</w:t>
+      </w:r>
+      <w:r>
+        <w:rPr>
+          <w:i/>
+          <w:iCs/>
+        </w:rPr>
+        <w:t xml:space="preserve">FollowUpService.closeAsAttended</w:t>
+      </w:r>
+      <w:r>
+        <w:t xml:space="preserve">) cierra una como atendida: las líneas abiertas quedan COMPLETED sin inventar horas (sin hora de inicio no cuenta para la puntualidad y sin hora de fin no suma horas trabajadas, pero sí cuenta como servicio hecho y como ingreso), la reserva avanza a IN_PROGRESS si hacía falta y luego a COMPLETED, y no se publica ServiceCompleted, para que al cliente no le llegue "ya puedes recogerlo" horas después; el cliente sí puede calificar. Si la reserva no está por cerrar, responde 409 BOOKING_NOT_TO_CLOSE. El "No asistió" del administrador sigue siendo el cambio de estado de booking-service (</w:t>
+      </w:r>
+      <w:r>
+        <w:rPr>
+          <w:i/>
+          <w:iCs/>
+        </w:rPr>
+        <w:t xml:space="preserve">PATCH /api/v1/admin/bookings/{id}/status</w:t>
+      </w:r>
+      <w:r>
+        <w:t xml:space="preserve">) y solo aplica a una reserva que nunca se inició. Las listas del operario ya no muestran reservas NO_SHOW ni CANCELLED. La tarea usa</w:t>
+      </w:r>
+      <w:r>
+        <w:t xml:space="preserve"> </w:t>
+      </w:r>
+      <w:r>
+        <w:rPr>
+          <w:i/>
+          <w:iCs/>
+        </w:rPr>
+        <w:t xml:space="preserve">FOLLOW_UP_ENABLED</w:t>
+      </w:r>
+      <w:r>
+        <w:t xml:space="preserve">,</w:t>
+      </w:r>
+      <w:r>
+        <w:t xml:space="preserve"> </w:t>
+      </w:r>
+      <w:r>
+        <w:rPr>
+          <w:i/>
+          <w:iCs/>
+        </w:rPr>
+        <w:t xml:space="preserve">FOLLOW_UP_INTERVAL</w:t>
+      </w:r>
+      <w:r>
+        <w:t xml:space="preserve"> </w:t>
+      </w:r>
+      <w:r>
+        <w:t xml:space="preserve">y</w:t>
+      </w:r>
+      <w:r>
+        <w:t xml:space="preserve"> </w:t>
+      </w:r>
+      <w:r>
+        <w:rPr>
+          <w:i/>
+          <w:iCs/>
+        </w:rPr>
+        <w:t xml:space="preserve">BOOKING_EXPIRY_GRACE_MINUTES</w:t>
+      </w:r>
+      <w:r>
+        <w:t xml:space="preserve">, y necesita</w:t>
+      </w:r>
+      <w:r>
+        <w:t xml:space="preserve"> </w:t>
+      </w:r>
+      <w:r>
+        <w:rPr>
+          <w:i/>
+          <w:iCs/>
+        </w:rPr>
+        <w:t xml:space="preserve">INTERNAL_API_KEY</w:t>
+      </w:r>
+      <w:r>
+        <w:t xml:space="preserve">.</w:t>
       </w:r>
       <w:r>
         <w:t xml:space="preserve"> </w:t>
@@ -18905,6 +20001,35 @@
           <w:b/>
           <w:bCs/>
         </w:rPr>
+        <w:t xml:space="preserve">Inspección (RF-036):</w:t>
+      </w:r>
+      <w:r>
+        <w:t xml:space="preserve"> </w:t>
+      </w:r>
+      <w:r>
+        <w:t xml:space="preserve">solo para servicios de 180 minutos o más; fases Recepción, Exterior, Interior, Motor y Entrega; hasta cinco fotos de 2 MB por hallazgo, guardadas en</w:t>
+      </w:r>
+      <w:r>
+        <w:t xml:space="preserve"> </w:t>
+      </w:r>
+      <w:r>
+        <w:rPr>
+          <w:i/>
+          <w:iCs/>
+        </w:rPr>
+        <w:t xml:space="preserve">execution.inspection_photo</w:t>
+      </w:r>
+      <w:r>
+        <w:t xml:space="preserve">; el enlace público usa un token aleatorio y solo funciona después de publicar.</w:t>
+      </w:r>
+      <w:r>
+        <w:t xml:space="preserve"> </w:t>
+      </w:r>
+      <w:r>
+        <w:rPr>
+          <w:b/>
+          <w:bCs/>
+        </w:rPr>
         <w:t xml:space="preserve">Eventos:</w:t>
       </w:r>
       <w:r>
@@ -18927,7 +20052,7 @@
         <w:t xml:space="preserve"> </w:t>
       </w:r>
       <w:r>
-        <w:t xml:space="preserve">y publica OperatorAssigned, ServiceStarted, ServiceCompleted e InspectionShared.</w:t>
+        <w:t xml:space="preserve">y publica OperatorAssigned, ServiceStarted, ServiceCompleted, InspectionShared, ServiceNotStarted y ServiceNotFinished.</w:t>
       </w:r>
     </w:p>
     <w:bookmarkEnd w:id="72"/>
@@ -19028,7 +20153,23 @@
         <w:t xml:space="preserve">AmountDueCalculator</w:t>
       </w:r>
       <w:r>
-        <w:t xml:space="preserve">); el pago que reporta el cliente pasa directamente a IN_REVIEW con el monto declarado; una referencia de transacción reutilizada se rechaza; el rechazo exige un motivo de hasta 200 caracteres; un pago manual queda aprobado de inmediato; la máquina de estados es PENDING → IN_REVIEW → APPROVED o REJECTED, y APPROVED → REFUNDED.</w:t>
+        <w:t xml:space="preserve">); el pago que reporta el cliente pasa directamente a IN_REVIEW con el monto declarado; una referencia de transacción reutilizada se rechaza; el comprobante pesa como máximo 2 MB (400 RECEIPT_TOO_LARGE; la web y la app lo comprimen antes de enviarlo);</w:t>
+      </w:r>
+      <w:r>
+        <w:t xml:space="preserve"> </w:t>
+      </w:r>
+      <w:r>
+        <w:rPr>
+          <w:i/>
+          <w:iCs/>
+        </w:rPr>
+        <w:t xml:space="preserve">GET /api/v1/payment-accounts</w:t>
+      </w:r>
+      <w:r>
+        <w:t xml:space="preserve"> </w:t>
+      </w:r>
+      <w:r>
+        <w:t xml:space="preserve">devuelve las cuentas activas, incluida la de efectivo mientras está activa; el rechazo exige un motivo de hasta 200 caracteres; un pago manual queda aprobado de inmediato; la máquina de estados es PENDING → IN_REVIEW → APPROVED o REJECTED, y APPROVED → REFUNDED.</w:t>
       </w:r>
       <w:r>
         <w:t xml:space="preserve"> </w:t>
@@ -19345,7 +20486,81 @@
         <w:t xml:space="preserve">deploy/publish-apk.sh</w:t>
       </w:r>
       <w:r>
-        <w:t xml:space="preserve">, avisa por push que hay una versión nueva de la aplicación.</w:t>
+        <w:t xml:space="preserve">, avisa por push que hay una versión nueva de la aplicación; desde el 21 de octubre de 2026, ServiceNotStarted y ServiceNotFinished (</w:t>
+      </w:r>
+      <w:r>
+        <w:rPr>
+          <w:i/>
+          <w:iCs/>
+        </w:rPr>
+        <w:t xml:space="preserve">execution.service_not_started</w:t>
+      </w:r>
+      <w:r>
+        <w:t xml:space="preserve"> </w:t>
+      </w:r>
+      <w:r>
+        <w:t xml:space="preserve">y</w:t>
+      </w:r>
+      <w:r>
+        <w:t xml:space="preserve"> </w:t>
+      </w:r>
+      <w:r>
+        <w:rPr>
+          <w:i/>
+          <w:iCs/>
+        </w:rPr>
+        <w:t xml:space="preserve">execution.service_not_finished</w:t>
+      </w:r>
+      <w:r>
+        <w:t xml:space="preserve">) generan</w:t>
+      </w:r>
+      <w:r>
+        <w:t xml:space="preserve"> </w:t>
+      </w:r>
+      <w:r>
+        <w:rPr>
+          <w:i/>
+          <w:iCs/>
+        </w:rPr>
+        <w:t xml:space="preserve">OPERATOR_SERVICE_NOT_REGISTERED</w:t>
+      </w:r>
+      <w:r>
+        <w:t xml:space="preserve"> </w:t>
+      </w:r>
+      <w:r>
+        <w:t xml:space="preserve">para el operario ("¿Atendiste este servicio?") y</w:t>
+      </w:r>
+      <w:r>
+        <w:t xml:space="preserve"> </w:t>
+      </w:r>
+      <w:r>
+        <w:rPr>
+          <w:i/>
+          <w:iCs/>
+        </w:rPr>
+        <w:t xml:space="preserve">ADMIN_SERVICE_NOT_REGISTERED</w:t>
+      </w:r>
+      <w:r>
+        <w:t xml:space="preserve"> </w:t>
+      </w:r>
+      <w:r>
+        <w:t xml:space="preserve">para cada administrador activo ("Servicio sin registrar"), solo en la bandeja y en push, con los tipos sembrados en el changelog 041, y un campo</w:t>
+      </w:r>
+      <w:r>
+        <w:t xml:space="preserve"> </w:t>
+      </w:r>
+      <w:r>
+        <w:rPr>
+          <w:i/>
+          <w:iCs/>
+        </w:rPr>
+        <w:t xml:space="preserve">null</w:t>
+      </w:r>
+      <w:r>
+        <w:t xml:space="preserve"> </w:t>
+      </w:r>
+      <w:r>
+        <w:t xml:space="preserve">en el payload de un evento se ignora en lugar de mandar el mensaje entero a la DLQ.</w:t>
       </w:r>
       <w:r>
         <w:t xml:space="preserve"> </w:t>
@@ -19440,7 +20655,36 @@
         <w:t xml:space="preserve"> </w:t>
       </w:r>
       <w:r>
-        <w:t xml:space="preserve">traduce los códigos de error. Todas las pantallas leen y guardan mediante la API: los datos del negocio usan</w:t>
+        <w:t xml:space="preserve">traduce los códigos de error. Desde el 21 de octubre de 2026 el servicio</w:t>
+      </w:r>
+      <w:r>
+        <w:t xml:space="preserve"> </w:t>
+      </w:r>
+      <w:r>
+        <w:rPr>
+          <w:i/>
+          <w:iCs/>
+        </w:rPr>
+        <w:t xml:space="preserve">auth</w:t>
+      </w:r>
+      <w:r>
+        <w:t xml:space="preserve"> </w:t>
+      </w:r>
+      <w:r>
+        <w:t xml:space="preserve">escucha el evento</w:t>
+      </w:r>
+      <w:r>
+        <w:t xml:space="preserve"> </w:t>
+      </w:r>
+      <w:r>
+        <w:rPr>
+          <w:i/>
+          <w:iCs/>
+        </w:rPr>
+        <w:t xml:space="preserve">storage</w:t>
+      </w:r>
+      <w:r>
+        <w:t xml:space="preserve">: si otra pestaña del mismo navegador cierra sesión, esta vuelve al inicio de sesión, y si entra otra cuenta, se recarga para no mostrar datos de la anterior; la pantalla de pagos comprime el comprobante a máximo 2 MB y amplía el QR con una lupa. Todas las pantallas leen y guardan mediante la API: los datos del negocio usan</w:t>
       </w:r>
       <w:r>
         <w:t xml:space="preserve"> </w:t>
@@ -19472,7 +20716,7 @@
         <w:t xml:space="preserve"> </w:t>
       </w:r>
       <w:r>
-        <w:t xml:space="preserve">sobre operations-service (las fotos se comprimen en el navegador antes de enviarse). Solo los reportes se calculan en el navegador a partir de las reservas y los pagos. Los roles y permisos, las promociones, la fidelización, las preferencias y los interruptores de notificación se leen y se guardan mediante la API (</w:t>
+        <w:t xml:space="preserve">sobre operations-service (las fotos se comprimen en el navegador antes de enviarse). Solo los reportes se calculan en el navegador a partir de las reservas y los pagos; desde el 21 de octubre de 2026 cuentan como servicios realizados solo las reservas completadas. Los roles y permisos, las promociones, la fidelización, las preferencias y los interruptores de notificación se leen y se guardan mediante la API (</w:t>
       </w:r>
       <w:r>
         <w:rPr>
@@ -19608,7 +20852,33 @@
         <w:t xml:space="preserve"> </w:t>
       </w:r>
       <w:r>
-        <w:t xml:space="preserve">o, si no está, del mismo equipo del gateway con el puerto 4200.</w:t>
+        <w:t xml:space="preserve">o, si no está, del mismo equipo del gateway con el puerto 4200. Desde la noche del 21 de octubre de 2026 el inicio del administrador, en la web (</w:t>
+      </w:r>
+      <w:r>
+        <w:rPr>
+          <w:i/>
+          <w:iCs/>
+        </w:rPr>
+        <w:t xml:space="preserve">reservations-store</w:t>
+      </w:r>
+      <w:r>
+        <w:t xml:space="preserve">) y en la app, muestra la tarjeta "Por cerrar" con los botones "Se atendió" y "No asistió" solo cuando hay reservas por cerrar, y las dos usan</w:t>
+      </w:r>
+      <w:r>
+        <w:t xml:space="preserve"> </w:t>
+      </w:r>
+      <w:r>
+        <w:rPr>
+          <w:i/>
+          <w:iCs/>
+        </w:rPr>
+        <w:t xml:space="preserve">GET /api/v1/admin/assignments/unassigned</w:t>
+      </w:r>
+      <w:r>
+        <w:t xml:space="preserve"> </w:t>
+      </w:r>
+      <w:r>
+        <w:t xml:space="preserve">para el conteo de reservas sin operario (si operations-service no responde, aplican la misma regla con los datos que tienen). En la app, además, el formulario de reserva del administrador guarda el operario y el estado elegidos, la barra de puntos del cliente queda completa cuando no queda nada por desbloquear y no muestra "0% OFF", el operario ve "—" en la calificación cuando no tiene calificaciones y su inicio no repite el contador "En progreso", la pestaña de roles dice que los tres roles son fijos y los permisos son de referencia, y los avisos nuevos abren la pantalla de servicios del operario o el inicio del administrador.</w:t>
       </w:r>
     </w:p>
     <w:bookmarkEnd w:id="75"/>
@@ -19724,7 +20994,7 @@
               <w:pStyle w:val="Compact"/>
             </w:pPr>
             <w:r>
-              <w:t xml:space="preserve">Creación → CONFIRMED; SCHEDULED → CONFIRMED; CONFIRMED → IN_PROGRESS → COMPLETED; SCHEDULED o CONFIRMED → CANCELLED o NO_SHOW.</w:t>
+              <w:t xml:space="preserve">Creación → CONFIRMED; SCHEDULED → CONFIRMED; CONFIRMED → IN_PROGRESS → COMPLETED; SCHEDULED o CONFIRMED → CANCELLED o NO_SHOW. El sistema solo cierra una reserva cuando está seguro, una hora después de su fin: SCHEDULED → CANCELLED con el motivo EXPIRED y CONFIRMED sin operario → NO_SHOW. Una CONFIRMED con operario que nadie registró no cambia sola: la resuelve el administrador (Se atendió → IN_PROGRESS → COMPLETED, o No asistió).</w:t>
             </w:r>
           </w:p>
         </w:tc>
@@ -19884,7 +21154,7 @@
       <w:r>
         <w:drawing>
           <wp:inline>
-            <wp:extent cx="5334000" cy="958203"/>
+            <wp:extent cx="5334000" cy="974173"/>
             <wp:effectExtent b="0" l="0" r="0" t="0"/>
             <wp:docPr descr="" title="" id="77" name="Picture"/>
             <a:graphic>
@@ -19905,7 +21175,7 @@
                   <pic:spPr bwMode="auto">
                     <a:xfrm>
                       <a:off x="0" y="0"/>
-                      <a:ext cx="5334000" cy="958203"/>
+                      <a:ext cx="5334000" cy="974173"/>
                     </a:xfrm>
                     <a:prstGeom prst="rect">
                       <a:avLst/>
@@ -19951,6 +21221,70 @@
       <w:r>
         <w:t xml:space="preserve">).</w:t>
       </w:r>
+      <w:r>
+        <w:t xml:space="preserve"> </w:t>
+      </w:r>
+      <w:r>
+        <w:rPr>
+          <w:i/>
+          <w:iCs/>
+        </w:rPr>
+        <w:t xml:space="preserve">Vencida</w:t>
+      </w:r>
+      <w:r>
+        <w:t xml:space="preserve"> </w:t>
+      </w:r>
+      <w:r>
+        <w:t xml:space="preserve">es el cierre automático de</w:t>
+      </w:r>
+      <w:r>
+        <w:t xml:space="preserve"> </w:t>
+      </w:r>
+      <w:r>
+        <w:rPr>
+          <w:i/>
+          <w:iCs/>
+        </w:rPr>
+        <w:t xml:space="preserve">ExpiredBookingsJob</w:t>
+      </w:r>
+      <w:r>
+        <w:t xml:space="preserve"> </w:t>
+      </w:r>
+      <w:r>
+        <w:t xml:space="preserve">(sección 12.3) y</w:t>
+      </w:r>
+      <w:r>
+        <w:t xml:space="preserve"> </w:t>
+      </w:r>
+      <w:r>
+        <w:rPr>
+          <w:i/>
+          <w:iCs/>
+        </w:rPr>
+        <w:t xml:space="preserve">terminó sin operario</w:t>
+      </w:r>
+      <w:r>
+        <w:t xml:space="preserve"> </w:t>
+      </w:r>
+      <w:r>
+        <w:t xml:space="preserve">lo pide</w:t>
+      </w:r>
+      <w:r>
+        <w:t xml:space="preserve"> </w:t>
+      </w:r>
+      <w:r>
+        <w:rPr>
+          <w:i/>
+          <w:iCs/>
+        </w:rPr>
+        <w:t xml:space="preserve">FollowUpJob</w:t>
+      </w:r>
+      <w:r>
+        <w:t xml:space="preserve"> </w:t>
+      </w:r>
+      <w:r>
+        <w:t xml:space="preserve">de operations-service (sección 12.4). Una reserva confirmada con operario que nadie registró no cambia de estado sola: la resuelve el administrador desde "Por cerrar" (Se atendió → IN_PROGRESS → COMPLETED, o No asistió).</w:t>
+      </w:r>
     </w:p>
     <w:bookmarkEnd w:id="79"/>
     <w:bookmarkEnd w:id="80"/>
@@ -20476,7 +21810,30 @@
         <w:t xml:space="preserve">jti</w:t>
       </w:r>
       <w:r>
-        <w:t xml:space="preserve">. No hay token de actualización: cuando el token vence, la persona ingresa de nuevo. Un JWT no se puede revocar antes de su vencimiento (Jones et al., 2015); cerrar la sesión solo cierra el registro de la sesión. Todo servicio valida la firma, el emisor y la audiencia con el mismo secreto.</w:t>
+        <w:t xml:space="preserve">. No hay token de actualización: cuando el token vence, la persona ingresa de nuevo. Un JWT no se puede revocar por sí mismo antes de su vencimiento (Jones et al., 2015). Desde el 21 de octubre de 2026 el sistema lo compensa con el claim</w:t>
+      </w:r>
+      <w:r>
+        <w:t xml:space="preserve"> </w:t>
+      </w:r>
+      <w:r>
+        <w:rPr>
+          <w:i/>
+          <w:iCs/>
+        </w:rPr>
+        <w:t xml:space="preserve">sid</w:t>
+      </w:r>
+      <w:r>
+        <w:t xml:space="preserve">: cerrar la sesión, o que el administrador inhabilite la cuenta o el dueño la desactive, cierra el registro de la sesión; security-service rechaza los tokens de esa sesión y el gateway se lo pregunta (</w:t>
+      </w:r>
+      <w:r>
+        <w:rPr>
+          <w:i/>
+          <w:iCs/>
+        </w:rPr>
+        <w:t xml:space="preserve">GET /api/v1/auth/session</w:t>
+      </w:r>
+      <w:r>
+        <w:t xml:space="preserve">) antes de pasar cualquier petición a los demás servicios, con la respuesta guardada 30 segundos por token (sección 9.2). Todo servicio valida la firma, el emisor y la audiencia con el mismo secreto.</w:t>
       </w:r>
     </w:p>
     <w:bookmarkEnd w:id="82"/>
@@ -20707,7 +22064,53 @@
               <w:pStyle w:val="Compact"/>
             </w:pPr>
             <w:r>
-              <w:t xml:space="preserve">Cierra la sesión.</w:t>
+              <w:t xml:space="preserve">Cierra la sesión; el token deja de servir.</w:t>
+            </w:r>
+          </w:p>
+        </w:tc>
+      </w:tr>
+      <w:tr>
+        <w:tc>
+          <w:tcPr/>
+          <w:p>
+            <w:pPr>
+              <w:pStyle w:val="Compact"/>
+            </w:pPr>
+            <w:r>
+              <w:t xml:space="preserve">GET</w:t>
+            </w:r>
+          </w:p>
+        </w:tc>
+        <w:tc>
+          <w:tcPr/>
+          <w:p>
+            <w:pPr>
+              <w:pStyle w:val="Compact"/>
+            </w:pPr>
+            <w:r>
+              <w:t xml:space="preserve">/api/v1/auth/session</w:t>
+            </w:r>
+          </w:p>
+        </w:tc>
+        <w:tc>
+          <w:tcPr/>
+          <w:p>
+            <w:pPr>
+              <w:pStyle w:val="Compact"/>
+            </w:pPr>
+            <w:r>
+              <w:t xml:space="preserve">Token</w:t>
+            </w:r>
+          </w:p>
+        </w:tc>
+        <w:tc>
+          <w:tcPr/>
+          <w:p>
+            <w:pPr>
+              <w:pStyle w:val="Compact"/>
+            </w:pPr>
+            <w:r>
+              <w:t xml:space="preserve">204 si la sesión del token sigue abierta; 401 si se cerró. La usa el gateway.</w:t>
             </w:r>
           </w:p>
         </w:tc>
@@ -21581,7 +22984,7 @@
               <w:pStyle w:val="Compact"/>
             </w:pPr>
             <w:r>
-              <w:t xml:space="preserve">Reservas propias y catálogo de motivos.</w:t>
+              <w:t xml:space="preserve">Reservas propias y catálogo de motivos (sin el motivo del sistema EXPIRED).</w:t>
             </w:r>
           </w:p>
         </w:tc>
@@ -22422,6 +23825,154 @@
               <w:pStyle w:val="Compact"/>
             </w:pPr>
             <w:r>
+              <w:t xml:space="preserve">GET</w:t>
+            </w:r>
+          </w:p>
+        </w:tc>
+        <w:tc>
+          <w:tcPr/>
+          <w:p>
+            <w:pPr>
+              <w:pStyle w:val="Compact"/>
+            </w:pPr>
+            <w:r>
+              <w:t xml:space="preserve">/api/v1/admin/assignments/unassigned (?from=&amp;to=)</w:t>
+            </w:r>
+          </w:p>
+        </w:tc>
+        <w:tc>
+          <w:tcPr/>
+          <w:p>
+            <w:pPr>
+              <w:pStyle w:val="Compact"/>
+            </w:pPr>
+            <w:r>
+              <w:t xml:space="preserve">ADMIN</w:t>
+            </w:r>
+          </w:p>
+        </w:tc>
+        <w:tc>
+          <w:tcPr/>
+          <w:p>
+            <w:pPr>
+              <w:pStyle w:val="Compact"/>
+            </w:pPr>
+            <w:r>
+              <w:rPr>
+                <w:i/>
+                <w:iCs/>
+              </w:rPr>
+              <w:t xml:space="preserve">{count, bookingIds}</w:t>
+            </w:r>
+            <w:r>
+              <w:t xml:space="preserve"> </w:t>
+            </w:r>
+            <w:r>
+              <w:t xml:space="preserve">de las reservas programadas o confirmadas sin operario que todavía no terminan; el panel y la pantalla de reservas de la web y de la app usan este conteo.</w:t>
+            </w:r>
+          </w:p>
+        </w:tc>
+      </w:tr>
+      <w:tr>
+        <w:tc>
+          <w:tcPr/>
+          <w:p>
+            <w:pPr>
+              <w:pStyle w:val="Compact"/>
+            </w:pPr>
+            <w:r>
+              <w:t xml:space="preserve">GET</w:t>
+            </w:r>
+          </w:p>
+        </w:tc>
+        <w:tc>
+          <w:tcPr/>
+          <w:p>
+            <w:pPr>
+              <w:pStyle w:val="Compact"/>
+            </w:pPr>
+            <w:r>
+              <w:t xml:space="preserve">/api/v1/admin/assignments/to-close (?from=&amp;to=)</w:t>
+            </w:r>
+          </w:p>
+        </w:tc>
+        <w:tc>
+          <w:tcPr/>
+          <w:p>
+            <w:pPr>
+              <w:pStyle w:val="Compact"/>
+            </w:pPr>
+            <w:r>
+              <w:t xml:space="preserve">ADMIN</w:t>
+            </w:r>
+          </w:p>
+        </w:tc>
+        <w:tc>
+          <w:tcPr/>
+          <w:p>
+            <w:pPr>
+              <w:pStyle w:val="Compact"/>
+            </w:pPr>
+            <w:r>
+              <w:t xml:space="preserve">Reservas con operario que terminaron sin registrarse (NOT_STARTED o NOT_FINISHED); por defecto, la última semana.</w:t>
+            </w:r>
+          </w:p>
+        </w:tc>
+      </w:tr>
+      <w:tr>
+        <w:tc>
+          <w:tcPr/>
+          <w:p>
+            <w:pPr>
+              <w:pStyle w:val="Compact"/>
+            </w:pPr>
+            <w:r>
+              <w:t xml:space="preserve">POST</w:t>
+            </w:r>
+          </w:p>
+        </w:tc>
+        <w:tc>
+          <w:tcPr/>
+          <w:p>
+            <w:pPr>
+              <w:pStyle w:val="Compact"/>
+            </w:pPr>
+            <w:r>
+              <w:t xml:space="preserve">/api/v1/admin/assignments/{bookingId}/attended</w:t>
+            </w:r>
+          </w:p>
+        </w:tc>
+        <w:tc>
+          <w:tcPr/>
+          <w:p>
+            <w:pPr>
+              <w:pStyle w:val="Compact"/>
+            </w:pPr>
+            <w:r>
+              <w:t xml:space="preserve">ADMIN</w:t>
+            </w:r>
+          </w:p>
+        </w:tc>
+        <w:tc>
+          <w:tcPr/>
+          <w:p>
+            <w:pPr>
+              <w:pStyle w:val="Compact"/>
+            </w:pPr>
+            <w:r>
+              <w:t xml:space="preserve">Cierra como atendida una reserva por cerrar, sin inventar horas (409 BOOKING_NOT_TO_CLOSE si no lo está).</w:t>
+            </w:r>
+          </w:p>
+        </w:tc>
+      </w:tr>
+      <w:tr>
+        <w:tc>
+          <w:tcPr/>
+          <w:p>
+            <w:pPr>
+              <w:pStyle w:val="Compact"/>
+            </w:pPr>
+            <w:r>
               <w:t xml:space="preserve">PUT</w:t>
             </w:r>
           </w:p>
@@ -22823,7 +24374,7 @@
               <w:pStyle w:val="Compact"/>
             </w:pPr>
             <w:r>
-              <w:t xml:space="preserve">Cuentas activas con QR.</w:t>
+              <w:t xml:space="preserve">Cuentas activas con QR; la de efectivo aparece solo mientras está activa.</w:t>
             </w:r>
           </w:p>
         </w:tc>
@@ -22869,7 +24420,7 @@
               <w:pStyle w:val="Compact"/>
             </w:pPr>
             <w:r>
-              <w:t xml:space="preserve">Reporta un pago con comprobante; pagos propios.</w:t>
+              <w:t xml:space="preserve">Reporta un pago con comprobante de máximo 2 MB (400 RECEIPT_TOO_LARGE); pagos propios.</w:t>
             </w:r>
           </w:p>
         </w:tc>
@@ -23589,6 +25140,52 @@
             </w:pPr>
             <w:r>
               <w:t xml:space="preserve">Reservas para la asignación automática de operations-service.</w:t>
+            </w:r>
+          </w:p>
+        </w:tc>
+      </w:tr>
+      <w:tr>
+        <w:tc>
+          <w:tcPr/>
+          <w:p>
+            <w:pPr>
+              <w:pStyle w:val="Compact"/>
+            </w:pPr>
+            <w:r>
+              <w:t xml:space="preserve">POST</w:t>
+            </w:r>
+          </w:p>
+        </w:tc>
+        <w:tc>
+          <w:tcPr/>
+          <w:p>
+            <w:pPr>
+              <w:pStyle w:val="Compact"/>
+            </w:pPr>
+            <w:r>
+              <w:t xml:space="preserve">/internal/v1/bookings/{id}/no-show</w:t>
+            </w:r>
+          </w:p>
+        </w:tc>
+        <w:tc>
+          <w:tcPr/>
+          <w:p>
+            <w:pPr>
+              <w:pStyle w:val="Compact"/>
+            </w:pPr>
+            <w:r>
+              <w:t xml:space="preserve">Llave interna</w:t>
+            </w:r>
+          </w:p>
+        </w:tc>
+        <w:tc>
+          <w:tcPr/>
+          <w:p>
+            <w:pPr>
+              <w:pStyle w:val="Compact"/>
+            </w:pPr>
+            <w:r>
+              <w:t xml:space="preserve">Pasa a NO_SHOW una reserva confirmada que terminó sin operario; solo la llama operations-service (409 BOOKING_NOT_EXPIRED si todavía no vence).</w:t>
             </w:r>
           </w:p>
         </w:tc>
@@ -24770,6 +26367,63 @@
               <w:pStyle w:val="Compact"/>
             </w:pPr>
             <w:r>
+              <w:t xml:space="preserve">Publicado (también cuando el sistema cancela una reserva vencida)</w:t>
+            </w:r>
+          </w:p>
+        </w:tc>
+      </w:tr>
+      <w:tr>
+        <w:tc>
+          <w:tcPr/>
+          <w:p>
+            <w:pPr>
+              <w:pStyle w:val="Compact"/>
+            </w:pPr>
+            <w:r>
+              <w:t xml:space="preserve">OperatorAssigned</w:t>
+            </w:r>
+          </w:p>
+        </w:tc>
+        <w:tc>
+          <w:tcPr/>
+          <w:p>
+            <w:pPr>
+              <w:pStyle w:val="Compact"/>
+            </w:pPr>
+            <w:r>
+              <w:t xml:space="preserve">execution.operator_assigned</w:t>
+            </w:r>
+          </w:p>
+        </w:tc>
+        <w:tc>
+          <w:tcPr/>
+          <w:p>
+            <w:pPr>
+              <w:pStyle w:val="Compact"/>
+            </w:pPr>
+            <w:r>
+              <w:t xml:space="preserve">operations-service</w:t>
+            </w:r>
+          </w:p>
+        </w:tc>
+        <w:tc>
+          <w:tcPr/>
+          <w:p>
+            <w:pPr>
+              <w:pStyle w:val="Compact"/>
+            </w:pPr>
+            <w:r>
+              <w:t xml:space="preserve">notification-service</w:t>
+            </w:r>
+          </w:p>
+        </w:tc>
+        <w:tc>
+          <w:tcPr/>
+          <w:p>
+            <w:pPr>
+              <w:pStyle w:val="Compact"/>
+            </w:pPr>
+            <w:r>
               <w:t xml:space="preserve">Publicado</w:t>
             </w:r>
           </w:p>
@@ -24783,18 +26437,18 @@
               <w:pStyle w:val="Compact"/>
             </w:pPr>
             <w:r>
-              <w:t xml:space="preserve">OperatorAssigned</w:t>
-            </w:r>
-          </w:p>
-        </w:tc>
-        <w:tc>
-          <w:tcPr/>
-          <w:p>
-            <w:pPr>
-              <w:pStyle w:val="Compact"/>
-            </w:pPr>
-            <w:r>
-              <w:t xml:space="preserve">execution.operator_assigned</w:t>
+              <w:t xml:space="preserve">ServiceStarted</w:t>
+            </w:r>
+          </w:p>
+        </w:tc>
+        <w:tc>
+          <w:tcPr/>
+          <w:p>
+            <w:pPr>
+              <w:pStyle w:val="Compact"/>
+            </w:pPr>
+            <w:r>
+              <w:t xml:space="preserve">execution.service_started</w:t>
             </w:r>
           </w:p>
         </w:tc>
@@ -24840,18 +26494,18 @@
               <w:pStyle w:val="Compact"/>
             </w:pPr>
             <w:r>
-              <w:t xml:space="preserve">ServiceStarted</w:t>
-            </w:r>
-          </w:p>
-        </w:tc>
-        <w:tc>
-          <w:tcPr/>
-          <w:p>
-            <w:pPr>
-              <w:pStyle w:val="Compact"/>
-            </w:pPr>
-            <w:r>
-              <w:t xml:space="preserve">execution.service_started</w:t>
+              <w:t xml:space="preserve">ServiceCompleted</w:t>
+            </w:r>
+          </w:p>
+        </w:tc>
+        <w:tc>
+          <w:tcPr/>
+          <w:p>
+            <w:pPr>
+              <w:pStyle w:val="Compact"/>
+            </w:pPr>
+            <w:r>
+              <w:t xml:space="preserve">execution.service_completed</w:t>
             </w:r>
           </w:p>
         </w:tc>
@@ -24897,18 +26551,18 @@
               <w:pStyle w:val="Compact"/>
             </w:pPr>
             <w:r>
-              <w:t xml:space="preserve">ServiceCompleted</w:t>
-            </w:r>
-          </w:p>
-        </w:tc>
-        <w:tc>
-          <w:tcPr/>
-          <w:p>
-            <w:pPr>
-              <w:pStyle w:val="Compact"/>
-            </w:pPr>
-            <w:r>
-              <w:t xml:space="preserve">execution.service_completed</w:t>
+              <w:t xml:space="preserve">InspectionShared</w:t>
+            </w:r>
+          </w:p>
+        </w:tc>
+        <w:tc>
+          <w:tcPr/>
+          <w:p>
+            <w:pPr>
+              <w:pStyle w:val="Compact"/>
+            </w:pPr>
+            <w:r>
+              <w:t xml:space="preserve">execution.inspection_shared</w:t>
             </w:r>
           </w:p>
         </w:tc>
@@ -24941,31 +26595,31 @@
               <w:pStyle w:val="Compact"/>
             </w:pPr>
             <w:r>
-              <w:t xml:space="preserve">Publicado</w:t>
-            </w:r>
-          </w:p>
-        </w:tc>
-      </w:tr>
-      <w:tr>
-        <w:tc>
-          <w:tcPr/>
-          <w:p>
-            <w:pPr>
-              <w:pStyle w:val="Compact"/>
-            </w:pPr>
-            <w:r>
-              <w:t xml:space="preserve">InspectionShared</w:t>
-            </w:r>
-          </w:p>
-        </w:tc>
-        <w:tc>
-          <w:tcPr/>
-          <w:p>
-            <w:pPr>
-              <w:pStyle w:val="Compact"/>
-            </w:pPr>
-            <w:r>
-              <w:t xml:space="preserve">execution.inspection_shared</w:t>
+              <w:t xml:space="preserve">Publicado (con el token del enlace público)</w:t>
+            </w:r>
+          </w:p>
+        </w:tc>
+      </w:tr>
+      <w:tr>
+        <w:tc>
+          <w:tcPr/>
+          <w:p>
+            <w:pPr>
+              <w:pStyle w:val="Compact"/>
+            </w:pPr>
+            <w:r>
+              <w:t xml:space="preserve">ServiceNotStarted, ServiceNotFinished</w:t>
+            </w:r>
+          </w:p>
+        </w:tc>
+        <w:tc>
+          <w:tcPr/>
+          <w:p>
+            <w:pPr>
+              <w:pStyle w:val="Compact"/>
+            </w:pPr>
+            <w:r>
+              <w:t xml:space="preserve">execution.service_not_started, execution.service_not_finished</w:t>
             </w:r>
           </w:p>
         </w:tc>
@@ -24998,7 +26652,7 @@
               <w:pStyle w:val="Compact"/>
             </w:pPr>
             <w:r>
-              <w:t xml:space="preserve">Publicado (con el token del enlace público)</w:t>
+              <w:t xml:space="preserve">Publicado una vez por reserva (desde el 21 de octubre de 2026)</w:t>
             </w:r>
           </w:p>
         </w:tc>
@@ -25330,7 +26984,65 @@
         <w:t xml:space="preserve">/health</w:t>
       </w:r>
       <w:r>
-        <w:t xml:space="preserve">). Todos comprueban la base de datos: payment-service espera como máximo 3 segundos a SQL Server y, si no responde, contesta DOWN con el código 503. Las verificaciones de integración recomendadas se describen en el Manual de Instalación, sección 16, y las pruebas de punta a punta de</w:t>
+        <w:t xml:space="preserve">). Todos comprueban la base de datos: payment-service espera como máximo 3 segundos a SQL Server y, si no responde, contesta DOWN con el código 503. En el servidor público,</w:t>
+      </w:r>
+      <w:r>
+        <w:t xml:space="preserve"> </w:t>
+      </w:r>
+      <w:r>
+        <w:rPr>
+          <w:i/>
+          <w:iCs/>
+        </w:rPr>
+        <w:t xml:space="preserve">docker-compose.prod.yml</w:t>
+      </w:r>
+      <w:r>
+        <w:t xml:space="preserve"> </w:t>
+      </w:r>
+      <w:r>
+        <w:t xml:space="preserve">revisa además la salud de todos los contenedores cada 30 segundos (</w:t>
+      </w:r>
+      <w:r>
+        <w:rPr>
+          <w:i/>
+          <w:iCs/>
+        </w:rPr>
+        <w:t xml:space="preserve">docker compose ps</w:t>
+      </w:r>
+      <w:r>
+        <w:t xml:space="preserve"> </w:t>
+      </w:r>
+      <w:r>
+        <w:t xml:space="preserve">los muestra</w:t>
+      </w:r>
+      <w:r>
+        <w:t xml:space="preserve"> </w:t>
+      </w:r>
+      <w:r>
+        <w:rPr>
+          <w:i/>
+          <w:iCs/>
+        </w:rPr>
+        <w:t xml:space="preserve">healthy</w:t>
+      </w:r>
+      <w:r>
+        <w:t xml:space="preserve"> </w:t>
+      </w:r>
+      <w:r>
+        <w:t xml:space="preserve">o</w:t>
+      </w:r>
+      <w:r>
+        <w:t xml:space="preserve"> </w:t>
+      </w:r>
+      <w:r>
+        <w:rPr>
+          <w:i/>
+          <w:iCs/>
+        </w:rPr>
+        <w:t xml:space="preserve">unhealthy</w:t>
+      </w:r>
+      <w:r>
+        <w:t xml:space="preserve">). Las verificaciones de integración recomendadas se describen en el Manual de Instalación, sección 16, y las pruebas de punta a punta de</w:t>
       </w:r>
       <w:r>
         <w:t xml:space="preserve"> </w:t>
@@ -25614,7 +27326,7 @@
               <w:pStyle w:val="Compact"/>
             </w:pPr>
             <w:r>
-              <w:t xml:space="preserve">security.user_session registra cada ingreso; el cierre de sesión fija revoked_at.</w:t>
+              <w:t xml:space="preserve">security.user_session registra cada ingreso; el cierre de sesión fija revoked_at, y desactivar o inhabilitar la cuenta cierra todas sus sesiones.</w:t>
             </w:r>
           </w:p>
         </w:tc>
@@ -25638,7 +27350,43 @@
               <w:pStyle w:val="Compact"/>
             </w:pPr>
             <w:r>
-              <w:t xml:space="preserve">Un token sigue siendo válido hasta que vence (riesgo aceptado de ADR-006).</w:t>
+              <w:t xml:space="preserve">Desde el 21 de octubre de 2026 el token de una sesión cerrada deja de servir: security-service lo rechaza por su claim</w:t>
+            </w:r>
+            <w:r>
+              <w:t xml:space="preserve"> </w:t>
+            </w:r>
+            <w:r>
+              <w:rPr>
+                <w:i/>
+                <w:iCs/>
+              </w:rPr>
+              <w:t xml:space="preserve">sid</w:t>
+            </w:r>
+            <w:r>
+              <w:t xml:space="preserve"> </w:t>
+            </w:r>
+            <w:r>
+              <w:t xml:space="preserve">(</w:t>
+            </w:r>
+            <w:r>
+              <w:rPr>
+                <w:i/>
+                <w:iCs/>
+              </w:rPr>
+              <w:t xml:space="preserve">ActiveSessionValidator</w:t>
+            </w:r>
+            <w:r>
+              <w:t xml:space="preserve">) y el gateway lo corta antes de los demás servicios (</w:t>
+            </w:r>
+            <w:r>
+              <w:rPr>
+                <w:i/>
+                <w:iCs/>
+              </w:rPr>
+              <w:t xml:space="preserve">SessionCheckFilter</w:t>
+            </w:r>
+            <w:r>
+              <w:t xml:space="preserve">, respuesta guardada 30 segundos por token; si security-service no responde, la petición sigue).</w:t>
             </w:r>
           </w:p>
         </w:tc>
@@ -25952,7 +27700,78 @@
         </w:numPr>
       </w:pPr>
       <w:r>
-        <w:t xml:space="preserve">HTTPS con TLS 1.2 o superior es obligatorio fuera del entorno local; solo se debe exponer el gateway.</w:t>
+        <w:t xml:space="preserve">HTTPS con TLS 1.2 o superior es obligatorio fuera del entorno local; solo se debe exponer el gateway. En el servidor público, Caddy agrega desde el 20 de octubre de 2026 los encabezados HSTS,</w:t>
+      </w:r>
+      <w:r>
+        <w:t xml:space="preserve"> </w:t>
+      </w:r>
+      <w:r>
+        <w:rPr>
+          <w:i/>
+          <w:iCs/>
+        </w:rPr>
+        <w:t xml:space="preserve">X-Content-Type-Options: nosniff</w:t>
+      </w:r>
+      <w:r>
+        <w:t xml:space="preserve">,</w:t>
+      </w:r>
+      <w:r>
+        <w:t xml:space="preserve"> </w:t>
+      </w:r>
+      <w:r>
+        <w:rPr>
+          <w:i/>
+          <w:iCs/>
+        </w:rPr>
+        <w:t xml:space="preserve">X-Frame-Options</w:t>
+      </w:r>
+      <w:r>
+        <w:t xml:space="preserve">,</w:t>
+      </w:r>
+      <w:r>
+        <w:t xml:space="preserve"> </w:t>
+      </w:r>
+      <w:r>
+        <w:rPr>
+          <w:i/>
+          <w:iCs/>
+        </w:rPr>
+        <w:t xml:space="preserve">Referrer-Policy</w:t>
+      </w:r>
+      <w:r>
+        <w:t xml:space="preserve"> </w:t>
+      </w:r>
+      <w:r>
+        <w:t xml:space="preserve">y</w:t>
+      </w:r>
+      <w:r>
+        <w:t xml:space="preserve"> </w:t>
+      </w:r>
+      <w:r>
+        <w:rPr>
+          <w:i/>
+          <w:iCs/>
+        </w:rPr>
+        <w:t xml:space="preserve">Permissions-Policy</w:t>
+      </w:r>
+      <w:r>
+        <w:t xml:space="preserve">, quita el encabezado</w:t>
+      </w:r>
+      <w:r>
+        <w:t xml:space="preserve"> </w:t>
+      </w:r>
+      <w:r>
+        <w:rPr>
+          <w:i/>
+          <w:iCs/>
+        </w:rPr>
+        <w:t xml:space="preserve">Server</w:t>
+      </w:r>
+      <w:r>
+        <w:t xml:space="preserve"> </w:t>
+      </w:r>
+      <w:r>
+        <w:t xml:space="preserve">y envía con la web una política de contenido (CSP) que solo permite código propio, Google Fonts y jsDelivr.</w:t>
       </w:r>
     </w:p>
     <w:p>
@@ -26144,7 +27963,7 @@
               <w:pStyle w:val="Compact"/>
             </w:pPr>
             <w:r>
-              <w:t xml:space="preserve">Aplicado (TLS pendiente en el despliegue)</w:t>
+              <w:t xml:space="preserve">Aplicado (TLS con Let's Encrypt en el servidor público)</w:t>
             </w:r>
           </w:p>
         </w:tc>
@@ -26238,7 +28057,7 @@
               <w:pStyle w:val="Compact"/>
             </w:pPr>
             <w:r>
-              <w:t xml:space="preserve">Sin trazas de pila en las respuestas; Swagger solo en dev.</w:t>
+              <w:t xml:space="preserve">Sin trazas de pila en las respuestas; Swagger solo en dev; encabezados de seguridad y CSP en el servidor público.</w:t>
             </w:r>
           </w:p>
         </w:tc>
@@ -26308,7 +28127,7 @@
               <w:pStyle w:val="Compact"/>
             </w:pPr>
             <w:r>
-              <w:t xml:space="preserve">Token de una hora; bloqueo temporal por intentos fallidos; sin límite de solicitudes en el gateway.</w:t>
+              <w:t xml:space="preserve">Token de una hora; el token de una sesión cerrada deja de servir; bloqueo temporal por intentos fallidos; sin límite de solicitudes en el gateway.</w:t>
             </w:r>
           </w:p>
         </w:tc>
@@ -26591,7 +28410,7 @@
         </w:numPr>
       </w:pPr>
       <w:r>
-        <w:t xml:space="preserve">Imposibilidad de revocar un JWT antes de su vencimiento.</w:t>
+        <w:t xml:space="preserve">El token de una sesión cerrada todavía sirve hasta 30 segundos (la respuesta que guarda el gateway) o, si security-service no responde, hasta que vence.</w:t>
       </w:r>
     </w:p>
     <w:p>
@@ -27581,7 +29400,84 @@
         <w:t xml:space="preserve">docker-compose.yml</w:t>
       </w:r>
       <w:r>
-        <w:t xml:space="preserve">.</w:t>
+        <w:t xml:space="preserve">. Las del 21 de octubre de 2026 (</w:t>
+      </w:r>
+      <w:r>
+        <w:rPr>
+          <w:i/>
+          <w:iCs/>
+        </w:rPr>
+        <w:t xml:space="preserve">SESSION_CHECK_*</w:t>
+      </w:r>
+      <w:r>
+        <w:t xml:space="preserve"> </w:t>
+      </w:r>
+      <w:r>
+        <w:t xml:space="preserve">del gateway,</w:t>
+      </w:r>
+      <w:r>
+        <w:t xml:space="preserve"> </w:t>
+      </w:r>
+      <w:r>
+        <w:rPr>
+          <w:i/>
+          <w:iCs/>
+        </w:rPr>
+        <w:t xml:space="preserve">BOOKING_EXPIRY_*</w:t>
+      </w:r>
+      <w:r>
+        <w:t xml:space="preserve"> </w:t>
+      </w:r>
+      <w:r>
+        <w:t xml:space="preserve">de booking-service, con</w:t>
+      </w:r>
+      <w:r>
+        <w:t xml:space="preserve"> </w:t>
+      </w:r>
+      <w:r>
+        <w:rPr>
+          <w:i/>
+          <w:iCs/>
+        </w:rPr>
+        <w:t xml:space="preserve">BOOKING_EXPIRY_GRACE_MINUTES</w:t>
+      </w:r>
+      <w:r>
+        <w:t xml:space="preserve"> </w:t>
+      </w:r>
+      <w:r>
+        <w:t xml:space="preserve">compartida con operations-service, y</w:t>
+      </w:r>
+      <w:r>
+        <w:t xml:space="preserve"> </w:t>
+      </w:r>
+      <w:r>
+        <w:rPr>
+          <w:i/>
+          <w:iCs/>
+        </w:rPr>
+        <w:t xml:space="preserve">FOLLOW_UP_ENABLED</w:t>
+      </w:r>
+      <w:r>
+        <w:t xml:space="preserve"> </w:t>
+      </w:r>
+      <w:r>
+        <w:t xml:space="preserve">y</w:t>
+      </w:r>
+      <w:r>
+        <w:t xml:space="preserve"> </w:t>
+      </w:r>
+      <w:r>
+        <w:rPr>
+          <w:i/>
+          <w:iCs/>
+        </w:rPr>
+        <w:t xml:space="preserve">FOLLOW_UP_INTERVAL</w:t>
+      </w:r>
+      <w:r>
+        <w:t xml:space="preserve"> </w:t>
+      </w:r>
+      <w:r>
+        <w:t xml:space="preserve">de operations-service) todavía no están en esos archivos, así que en Docker quedan con su valor por defecto (acción ACO-14).</w:t>
       </w:r>
     </w:p>
     <w:bookmarkEnd w:id="101"/>
@@ -27795,19 +29691,7 @@
         </w:numPr>
       </w:pPr>
       <w:r>
-        <w:t xml:space="preserve">El siguiente changeset de la numeración global es el 040.</w:t>
-      </w:r>
-    </w:p>
-    <w:p>
-      <w:pPr>
-        <w:pStyle w:val="Compact"/>
-        <w:numPr>
-          <w:ilvl w:val="0"/>
-          <w:numId w:val="1025"/>
-        </w:numPr>
-      </w:pPr>
-      <w:r>
-        <w:t xml:space="preserve">El siguiente changeset de la numeración global es el 031.</w:t>
+        <w:t xml:space="preserve">El siguiente changeset de la numeración global es el 042.</w:t>
       </w:r>
     </w:p>
     <w:bookmarkEnd w:id="103"/>
@@ -27825,7 +29709,123 @@
         <w:pStyle w:val="FirstParagraph"/>
       </w:pPr>
       <w:r>
-        <w:t xml:space="preserve">La estrategia de pruebas propone una pirámide de pruebas unitarias, de integración, de contrato y de punta a punta, con al menos un 80 % de cobertura de líneas y un 90 % en el dominio. El 19 de octubre de 2026 se ejecutaron todas las pruebas con estos resultados: 655 pruebas unitarias y de integración aprobadas (web 43, gateway 34, security-service 151, customer-service 69, booking-service 43, operations-service 55, notification-service 112 y payment-service 148, incluidas las 7 de persistencia contra una base aislada), 19 de 19 pruebas de punta a punta y 42 de 42 casos funcionales aprobados contra el sistema completo (</w:t>
+        <w:t xml:space="preserve">La estrategia de pruebas propone una pirámide de pruebas unitarias, de integración, de contrato y de punta a punta, con al menos un 80 % de cobertura de líneas y un 90 % en el dominio. En la noche del 21 de octubre de 2026 se ejecutaron todas las pruebas automatizadas con estos resultados: 707 pruebas unitarias y de integración aprobadas, ninguna omitida (web 62 en 41 archivos, gateway 40, security-service 155, customer-service 69, booking-service 50, operations-service 67, notification-service 114 y payment-service 150: 115 de dominio, 28 de aplicación y 7 de persistencia contra la base aislada</w:t>
+      </w:r>
+      <w:r>
+        <w:t xml:space="preserve"> </w:t>
+      </w:r>
+      <w:r>
+        <w:rPr>
+          <w:i/>
+          <w:iCs/>
+        </w:rPr>
+        <w:t xml:space="preserve">LavaRapidoPaymentIT</w:t>
+      </w:r>
+      <w:r>
+        <w:t xml:space="preserve">), 18 más que en la ejecución anterior del mismo día por las clases nuevas</w:t>
+      </w:r>
+      <w:r>
+        <w:t xml:space="preserve"> </w:t>
+      </w:r>
+      <w:r>
+        <w:rPr>
+          <w:i/>
+          <w:iCs/>
+        </w:rPr>
+        <w:t xml:space="preserve">FollowUpPolicyTest</w:t>
+      </w:r>
+      <w:r>
+        <w:t xml:space="preserve"> </w:t>
+      </w:r>
+      <w:r>
+        <w:t xml:space="preserve">y</w:t>
+      </w:r>
+      <w:r>
+        <w:t xml:space="preserve"> </w:t>
+      </w:r>
+      <w:r>
+        <w:rPr>
+          <w:i/>
+          <w:iCs/>
+        </w:rPr>
+        <w:t xml:space="preserve">FollowUpServiceTest</w:t>
+      </w:r>
+      <w:r>
+        <w:t xml:space="preserve"> </w:t>
+      </w:r>
+      <w:r>
+        <w:t xml:space="preserve">(operations) y</w:t>
+      </w:r>
+      <w:r>
+        <w:t xml:space="preserve"> </w:t>
+      </w:r>
+      <w:r>
+        <w:rPr>
+          <w:i/>
+          <w:iCs/>
+        </w:rPr>
+        <w:t xml:space="preserve">DomainEventEnvelopeTest</w:t>
+      </w:r>
+      <w:r>
+        <w:t xml:space="preserve"> </w:t>
+      </w:r>
+      <w:r>
+        <w:t xml:space="preserve">(notification), la ruta interna de no asistió en</w:t>
+      </w:r>
+      <w:r>
+        <w:t xml:space="preserve"> </w:t>
+      </w:r>
+      <w:r>
+        <w:rPr>
+          <w:i/>
+          <w:iCs/>
+        </w:rPr>
+        <w:t xml:space="preserve">BookingServiceTest</w:t>
+      </w:r>
+      <w:r>
+        <w:t xml:space="preserve"> </w:t>
+      </w:r>
+      <w:r>
+        <w:t xml:space="preserve">y</w:t>
+      </w:r>
+      <w:r>
+        <w:t xml:space="preserve"> </w:t>
+      </w:r>
+      <w:r>
+        <w:rPr>
+          <w:i/>
+          <w:iCs/>
+        </w:rPr>
+        <w:t xml:space="preserve">BookingApiWebTest</w:t>
+      </w:r>
+      <w:r>
+        <w:t xml:space="preserve"> </w:t>
+      </w:r>
+      <w:r>
+        <w:t xml:space="preserve">y "Por cerrar" en</w:t>
+      </w:r>
+      <w:r>
+        <w:t xml:space="preserve"> </w:t>
+      </w:r>
+      <w:r>
+        <w:rPr>
+          <w:i/>
+          <w:iCs/>
+        </w:rPr>
+        <w:t xml:space="preserve">reservations-store.spec.ts</w:t>
+      </w:r>
+      <w:r>
+        <w:t xml:space="preserve">; además, 19 de 19 pruebas de punta a punta, ya con el chequeo de sesión del gateway. La app móvil no tiene pruebas automatizadas: su integración continua revisa los tipos (</w:t>
+      </w:r>
+      <w:r>
+        <w:rPr>
+          <w:i/>
+          <w:iCs/>
+        </w:rPr>
+        <w:t xml:space="preserve">npx tsc --noEmit</w:t>
+      </w:r>
+      <w:r>
+        <w:t xml:space="preserve">); los 42 casos funcionales se ejecutaron por última vez el 19 de octubre de 2026 y pasaron todos contra el sistema completo (</w:t>
       </w:r>
       <w:r>
         <w:rPr>
@@ -27963,18 +29963,215 @@
               <w:pStyle w:val="Compact"/>
             </w:pPr>
             <w:r>
-              <w:t xml:space="preserve">Token vencido o JWT_SECRET, emisor o audiencia distintos.</w:t>
-            </w:r>
-          </w:p>
-        </w:tc>
-        <w:tc>
-          <w:tcPr/>
-          <w:p>
-            <w:pPr>
-              <w:pStyle w:val="Compact"/>
-            </w:pPr>
-            <w:r>
-              <w:t xml:space="preserve">Ingresar de nuevo; verificar el archivo .env.</w:t>
+              <w:t xml:space="preserve">Token vencido, JWT_SECRET, emisor o audiencia distintos, o sesión cerrada (logout en otro dispositivo o cuenta inhabilitada).</w:t>
+            </w:r>
+          </w:p>
+        </w:tc>
+        <w:tc>
+          <w:tcPr/>
+          <w:p>
+            <w:pPr>
+              <w:pStyle w:val="Compact"/>
+            </w:pPr>
+            <w:r>
+              <w:t xml:space="preserve">Ingresar de nuevo; verificar el archivo .env;</w:t>
+            </w:r>
+            <w:r>
+              <w:t xml:space="preserve"> </w:t>
+            </w:r>
+            <w:r>
+              <w:rPr>
+                <w:i/>
+                <w:iCs/>
+              </w:rPr>
+              <w:t xml:space="preserve">GET /api/v1/auth/session</w:t>
+            </w:r>
+            <w:r>
+              <w:t xml:space="preserve"> </w:t>
+            </w:r>
+            <w:r>
+              <w:t xml:space="preserve">con el token dice si la sesión sigue abierta.</w:t>
+            </w:r>
+          </w:p>
+        </w:tc>
+      </w:tr>
+      <w:tr>
+        <w:tc>
+          <w:tcPr/>
+          <w:p>
+            <w:pPr>
+              <w:pStyle w:val="Compact"/>
+            </w:pPr>
+            <w:r>
+              <w:t xml:space="preserve">400 RECEIPT_TOO_LARGE al reportar un pago</w:t>
+            </w:r>
+          </w:p>
+        </w:tc>
+        <w:tc>
+          <w:tcPr/>
+          <w:p>
+            <w:pPr>
+              <w:pStyle w:val="Compact"/>
+            </w:pPr>
+            <w:r>
+              <w:t xml:space="preserve">El comprobante pesa más de 2 MB (un cliente sin la compresión de la web o de la app actualizada).</w:t>
+            </w:r>
+          </w:p>
+        </w:tc>
+        <w:tc>
+          <w:tcPr/>
+          <w:p>
+            <w:pPr>
+              <w:pStyle w:val="Compact"/>
+            </w:pPr>
+            <w:r>
+              <w:t xml:space="preserve">Subirlo desde la web o desde la app actualizada, que comprimen la imagen.</w:t>
+            </w:r>
+          </w:p>
+        </w:tc>
+      </w:tr>
+      <w:tr>
+        <w:tc>
+          <w:tcPr/>
+          <w:p>
+            <w:pPr>
+              <w:pStyle w:val="Compact"/>
+            </w:pPr>
+            <w:r>
+              <w:t xml:space="preserve">Una reserva pasó sola a No asistió o Cancelada</w:t>
+            </w:r>
+          </w:p>
+        </w:tc>
+        <w:tc>
+          <w:tcPr/>
+          <w:p>
+            <w:pPr>
+              <w:pStyle w:val="Compact"/>
+            </w:pPr>
+            <w:r>
+              <w:t xml:space="preserve">Pasó una hora de su fin y era programada sin confirmar (</w:t>
+            </w:r>
+            <w:r>
+              <w:rPr>
+                <w:i/>
+                <w:iCs/>
+              </w:rPr>
+              <w:t xml:space="preserve">ExpiredBookingsJob</w:t>
+            </w:r>
+            <w:r>
+              <w:t xml:space="preserve">) o confirmada sin operario (</w:t>
+            </w:r>
+            <w:r>
+              <w:rPr>
+                <w:i/>
+                <w:iCs/>
+              </w:rPr>
+              <w:t xml:space="preserve">FollowUpJob</w:t>
+            </w:r>
+            <w:r>
+              <w:t xml:space="preserve">).</w:t>
+            </w:r>
+          </w:p>
+        </w:tc>
+        <w:tc>
+          <w:tcPr/>
+          <w:p>
+            <w:pPr>
+              <w:pStyle w:val="Compact"/>
+            </w:pPr>
+            <w:r>
+              <w:t xml:space="preserve">Estado y motivo de la reserva (EXPIRED en las canceladas); registros de booking-service (</w:t>
+            </w:r>
+            <w:r>
+              <w:rPr>
+                <w:i/>
+                <w:iCs/>
+              </w:rPr>
+              <w:t xml:space="preserve">Closed N expired bookings</w:t>
+            </w:r>
+            <w:r>
+              <w:t xml:space="preserve">) y de operations-service (</w:t>
+            </w:r>
+            <w:r>
+              <w:rPr>
+                <w:i/>
+                <w:iCs/>
+              </w:rPr>
+              <w:t xml:space="preserve">Follow-up: N booking(s) closed as not attended</w:t>
+            </w:r>
+            <w:r>
+              <w:t xml:space="preserve">).</w:t>
+            </w:r>
+          </w:p>
+        </w:tc>
+      </w:tr>
+      <w:tr>
+        <w:tc>
+          <w:tcPr/>
+          <w:p>
+            <w:pPr>
+              <w:pStyle w:val="Compact"/>
+            </w:pPr>
+            <w:r>
+              <w:t xml:space="preserve">Una reserva aparece en "Por cerrar"</w:t>
+            </w:r>
+          </w:p>
+        </w:tc>
+        <w:tc>
+          <w:tcPr/>
+          <w:p>
+            <w:pPr>
+              <w:pStyle w:val="Compact"/>
+            </w:pPr>
+            <w:r>
+              <w:t xml:space="preserve">Tenía operario y nadie la inició, o se inició y nadie la finalizó.</w:t>
+            </w:r>
+          </w:p>
+        </w:tc>
+        <w:tc>
+          <w:tcPr/>
+          <w:p>
+            <w:pPr>
+              <w:pStyle w:val="Compact"/>
+            </w:pPr>
+            <w:r>
+              <w:rPr>
+                <w:i/>
+                <w:iCs/>
+              </w:rPr>
+              <w:t xml:space="preserve">GET /api/v1/admin/assignments/to-close</w:t>
+            </w:r>
+            <w:r>
+              <w:t xml:space="preserve">; estado de sus filas de</w:t>
+            </w:r>
+            <w:r>
+              <w:t xml:space="preserve"> </w:t>
+            </w:r>
+            <w:r>
+              <w:rPr>
+                <w:i/>
+                <w:iCs/>
+              </w:rPr>
+              <w:t xml:space="preserve">service_execution</w:t>
+            </w:r>
+            <w:r>
+              <w:t xml:space="preserve"> </w:t>
+            </w:r>
+            <w:r>
+              <w:t xml:space="preserve">y</w:t>
+            </w:r>
+            <w:r>
+              <w:t xml:space="preserve"> </w:t>
+            </w:r>
+            <w:r>
+              <w:rPr>
+                <w:i/>
+                <w:iCs/>
+              </w:rPr>
+              <w:t xml:space="preserve">follow_up_notice_at</w:t>
+            </w:r>
+            <w:r>
+              <w:t xml:space="preserve">.</w:t>
             </w:r>
           </w:p>
         </w:tc>
@@ -28568,7 +30765,7 @@
         <w:t xml:space="preserve"> </w:t>
       </w:r>
       <w:r>
-        <w:t xml:space="preserve">de la documentación (Equipo de Desarrollo Vehicle Washing, 2026a), revisado contra el código el 16 de octubre de 2026. Entre el 8 y el 16 de octubre de 2026 se resolvieron TD-001, TD-002, TD-003, TD-009, TD-013, TD-014, TD-015, TD-016, TD-017, TD-018, TD-020 y TD-021; su cierre se registra en el documento de acciones correctivas, preventivas y de mejoramiento. El 19 de octubre de 2026 se cerró también TD-006, con la integración continua en GitHub Actions.</w:t>
+        <w:t xml:space="preserve">de la documentación (Equipo de Desarrollo Vehicle Washing, 2026a), revisado contra el código el 16 de octubre de 2026. Entre el 8 y el 16 de octubre de 2026 se resolvieron TD-001, TD-002, TD-003, TD-009, TD-013, TD-014, TD-015, TD-016, TD-017, TD-018, TD-020 y TD-021; su cierre se registra en el documento de acciones correctivas, preventivas y de mejoramiento. El 19 de octubre de 2026 se cerró también TD-006, con la integración continua en GitHub Actions. El 21 de octubre de 2026 se cerraron TD-024 (tokens de sesiones cerradas), TD-025 (reservas que nadie cerraba y conteo de reservas sin operario) y TD-026 (asignación doble de un operario); en la noche del mismo día se ajustó la regla de TD-025 para que una reserva con operario no quede en No asistió sin que lo decida el administrador; y TD-027 (pruebas de las pantallas del administrador) quedó resuelta para reservas, gestión y reportes.</w:t>
       </w:r>
     </w:p>
     <w:bookmarkEnd w:id="106"/>
@@ -28728,7 +30925,7 @@
               <w:pStyle w:val="Compact"/>
             </w:pPr>
             <w:r>
-              <w:t xml:space="preserve">Punto de entrada externo único que enruta las solicitudes; en este sistema no valida tokens.</w:t>
+              <w:t xml:space="preserve">Punto de entrada externo único que enruta las solicitudes; en este sistema no verifica la firma de los tokens, pero desde el 21 de octubre de 2026 corta los de sesiones cerradas.</w:t>
             </w:r>
           </w:p>
         </w:tc>
@@ -29857,7 +32054,7 @@
               <w:pStyle w:val="Compact"/>
             </w:pPr>
             <w:r>
-              <w:t xml:space="preserve">Documentación del gateway y ADR-006: no valida tokens; lo hace cada servicio.</w:t>
+              <w:t xml:space="preserve">Documentación del gateway y ADR-006: no verifica la firma de los tokens; lo hace cada servicio. Desde el 2026-10-21 sí corta los tokens de sesiones cerradas, preguntando a security-service.</w:t>
             </w:r>
           </w:p>
         </w:tc>
@@ -29940,6 +32137,86 @@
               <w:pStyle w:val="Compact"/>
             </w:pPr>
             <w:r>
+              <w:t xml:space="preserve">Cierre de reservas que nadie registró</w:t>
+            </w:r>
+          </w:p>
+        </w:tc>
+        <w:tc>
+          <w:tcPr/>
+          <w:p>
+            <w:pPr>
+              <w:pStyle w:val="Compact"/>
+            </w:pPr>
+            <w:r>
+              <w:t xml:space="preserve">La versión 4.5 decía que toda reserva CONFIRMED que nadie iniciaba pasaba sola a NO_SHOW una hora después de su fin.</w:t>
+            </w:r>
+          </w:p>
+        </w:tc>
+        <w:tc>
+          <w:tcPr/>
+          <w:p>
+            <w:pPr>
+              <w:pStyle w:val="Compact"/>
+            </w:pPr>
+            <w:r>
+              <w:t xml:space="preserve">Código de la noche del 2026-10-21: solo pasa sola la CONFIRMED sin operario; la que tenía operario queda "por cerrar" para el administrador (</w:t>
+            </w:r>
+            <w:r>
+              <w:rPr>
+                <w:i/>
+                <w:iCs/>
+              </w:rPr>
+              <w:t xml:space="preserve">FollowUpPolicy</w:t>
+            </w:r>
+            <w:r>
+              <w:t xml:space="preserve">). Resuelta.</w:t>
+            </w:r>
+          </w:p>
+        </w:tc>
+      </w:tr>
+      <w:tr>
+        <w:tc>
+          <w:tcPr/>
+          <w:p>
+            <w:pPr>
+              <w:pStyle w:val="Compact"/>
+            </w:pPr>
+            <w:r>
+              <w:t xml:space="preserve">Revocación de tokens</w:t>
+            </w:r>
+          </w:p>
+        </w:tc>
+        <w:tc>
+          <w:tcPr/>
+          <w:p>
+            <w:pPr>
+              <w:pStyle w:val="Compact"/>
+            </w:pPr>
+            <w:r>
+              <w:t xml:space="preserve">Hasta la versión 4.4 un token seguía sirviendo hasta su vencimiento después de cerrar sesión.</w:t>
+            </w:r>
+          </w:p>
+        </w:tc>
+        <w:tc>
+          <w:tcPr/>
+          <w:p>
+            <w:pPr>
+              <w:pStyle w:val="Compact"/>
+            </w:pPr>
+            <w:r>
+              <w:t xml:space="preserve">Código del 2026-10-21: el token de una sesión cerrada deja de servir en security-service y en el gateway (TD-024). Resuelta.</w:t>
+            </w:r>
+          </w:p>
+        </w:tc>
+      </w:tr>
+      <w:tr>
+        <w:tc>
+          <w:tcPr/>
+          <w:p>
+            <w:pPr>
+              <w:pStyle w:val="Compact"/>
+            </w:pPr>
+            <w:r>
               <w:t xml:space="preserve">Auditoría</w:t>
             </w:r>
           </w:p>
@@ -30278,6 +32555,51 @@
             </w:pPr>
             <w:r>
               <w:t xml:space="preserve">Código: módulo completo bajo /admin.</w:t>
+            </w:r>
+          </w:p>
+        </w:tc>
+      </w:tr>
+      <w:tr>
+        <w:tc>
+          <w:tcPr/>
+          <w:p>
+            <w:pPr>
+              <w:pStyle w:val="Compact"/>
+            </w:pPr>
+            <w:r>
+              <w:t xml:space="preserve">README de lavarapido-api-gateway</w:t>
+            </w:r>
+          </w:p>
+        </w:tc>
+        <w:tc>
+          <w:tcPr/>
+          <w:p>
+            <w:pPr>
+              <w:pStyle w:val="Compact"/>
+            </w:pPr>
+            <w:r>
+              <w:t xml:space="preserve">Decía que el gateway no respondía CORS y no listaba las rutas de operations-service y payment-service.</w:t>
+            </w:r>
+          </w:p>
+        </w:tc>
+        <w:tc>
+          <w:tcPr/>
+          <w:p>
+            <w:pPr>
+              <w:pStyle w:val="Compact"/>
+            </w:pPr>
+            <w:r>
+              <w:t xml:space="preserve">Corregido el 2026-10-21: responde CORS (</w:t>
+            </w:r>
+            <w:r>
+              <w:rPr>
+                <w:i/>
+                <w:iCs/>
+              </w:rPr>
+              <w:t xml:space="preserve">CorsConfig</w:t>
+            </w:r>
+            <w:r>
+              <w:t xml:space="preserve">), corta los tokens de sesiones cerradas y lista todas las rutas. Resuelta.</w:t>
             </w:r>
           </w:p>
         </w:tc>

</xml_diff>